<commit_message>
updated web pages generating, updated dining car menu, added website qr code and removed .vs folder
</commit_message>
<xml_diff>
--- a/documents/dining-car-menu.docx
+++ b/documents/dining-car-menu.docx
@@ -7,6 +7,8 @@
         <w:jc w:val="center"/>
         <w:rPr>
           <w:rFonts w:ascii="Noto Sans" w:hAnsi="Noto Sans"/>
+          <w:sz w:val="300"/>
+          <w:szCs w:val="300"/>
         </w:rPr>
       </w:pPr>
       <w:r>
@@ -14,8 +16,8 @@
           <w:rFonts w:ascii="Noto Sans" w:hAnsi="Noto Sans"/>
           <w:b/>
           <w:color w:val="FF0000"/>
-          <w:sz w:val="400"/>
-          <w:szCs w:val="400"/>
+          <w:sz w:val="300"/>
+          <w:szCs w:val="300"/>
         </w:rPr>
         <w:t>SRT</w:t>
       </w:r>
@@ -23,6 +25,102 @@
     <w:p>
       <w:pPr>
         <w:jc w:val="center"/>
+        <w:rPr>
+          <w:rFonts w:ascii="Noto Sans" w:hAnsi="Noto Sans"/>
+          <w:b/>
+          <w:sz w:val="80"/>
+          <w:szCs w:val="80"/>
+        </w:rPr>
+      </w:pPr>
+      <w:r>
+        <w:rPr>
+          <w:rFonts w:ascii="Noto Sans" w:hAnsi="Noto Sans"/>
+          <w:b/>
+          <w:sz w:val="80"/>
+          <w:szCs w:val="80"/>
+        </w:rPr>
+        <w:t>Dining Car Menu</w:t>
+      </w:r>
+      <w:r>
+        <w:rPr>
+          <w:rFonts w:ascii="Noto Sans" w:hAnsi="Noto Sans"/>
+          <w:noProof/>
+        </w:rPr>
+        <w:drawing>
+          <wp:inline distT="0" distB="0" distL="0" distR="0" wp14:anchorId="787B626D" wp14:editId="6C10AB05">
+            <wp:extent cx="2152650" cy="2152650"/>
+            <wp:effectExtent l="0" t="0" r="0" b="0"/>
+            <wp:docPr id="2078267603" name="Grafický objekt 1"/>
+            <wp:cNvGraphicFramePr>
+              <a:graphicFrameLocks xmlns:a="http://schemas.openxmlformats.org/drawingml/2006/main" noChangeAspect="1"/>
+            </wp:cNvGraphicFramePr>
+            <a:graphic xmlns:a="http://schemas.openxmlformats.org/drawingml/2006/main">
+              <a:graphicData uri="http://schemas.openxmlformats.org/drawingml/2006/picture">
+                <pic:pic xmlns:pic="http://schemas.openxmlformats.org/drawingml/2006/picture">
+                  <pic:nvPicPr>
+                    <pic:cNvPr id="2078267603" name="Grafický objekt 2078267603"/>
+                    <pic:cNvPicPr/>
+                  </pic:nvPicPr>
+                  <pic:blipFill>
+                    <a:blip r:embed="rId6">
+                      <a:extLst>
+                        <a:ext uri="{96DAC541-7B7A-43D3-8B79-37D633B846F1}">
+                          <asvg:svgBlip xmlns:asvg="http://schemas.microsoft.com/office/drawing/2016/SVG/main" r:embed="rId7"/>
+                        </a:ext>
+                      </a:extLst>
+                    </a:blip>
+                    <a:stretch>
+                      <a:fillRect/>
+                    </a:stretch>
+                  </pic:blipFill>
+                  <pic:spPr>
+                    <a:xfrm>
+                      <a:off x="0" y="0"/>
+                      <a:ext cx="2152650" cy="2152650"/>
+                    </a:xfrm>
+                    <a:prstGeom prst="rect">
+                      <a:avLst/>
+                    </a:prstGeom>
+                  </pic:spPr>
+                </pic:pic>
+              </a:graphicData>
+            </a:graphic>
+          </wp:inline>
+        </w:drawing>
+      </w:r>
+    </w:p>
+    <w:p>
+      <w:pPr>
+        <w:jc w:val="center"/>
+        <w:rPr>
+          <w:rFonts w:ascii="Noto Sans" w:hAnsi="Noto Sans"/>
+          <w:b/>
+          <w:sz w:val="32"/>
+          <w:szCs w:val="32"/>
+        </w:rPr>
+      </w:pPr>
+      <w:r>
+        <w:rPr>
+          <w:rFonts w:ascii="Noto Sans" w:hAnsi="Noto Sans"/>
+          <w:b/>
+          <w:sz w:val="32"/>
+          <w:szCs w:val="32"/>
+        </w:rPr>
+        <w:t>Website</w:t>
+      </w:r>
+    </w:p>
+    <w:p>
+      <w:pPr>
+        <w:rPr>
+          <w:rFonts w:ascii="Noto Sans" w:hAnsi="Noto Sans"/>
+          <w:b/>
+          <w:sz w:val="80"/>
+          <w:szCs w:val="80"/>
+        </w:rPr>
+      </w:pPr>
+    </w:p>
+    <w:p>
+      <w:pPr>
         <w:rPr>
           <w:rFonts w:ascii="Noto Sans" w:hAnsi="Noto Sans"/>
         </w:rPr>
@@ -33,15 +131,6 @@
           <w:formProt w:val="0"/>
         </w:sectPr>
       </w:pPr>
-      <w:r>
-        <w:rPr>
-          <w:rFonts w:ascii="Noto Sans" w:hAnsi="Noto Sans"/>
-          <w:b/>
-          <w:sz w:val="80"/>
-          <w:szCs w:val="80"/>
-        </w:rPr>
-        <w:t>Dining Car Menu</w:t>
-      </w:r>
     </w:p>
     <w:p>
       <w:pPr>
@@ -355,13 +444,6 @@
           <w:szCs w:val="28"/>
         </w:rPr>
         <w:tab/>
-      </w:r>
-      <w:r>
-        <w:rPr>
-          <w:rFonts w:ascii="Noto Sans" w:hAnsi="Noto Sans"/>
-          <w:sz w:val="28"/>
-          <w:szCs w:val="28"/>
-        </w:rPr>
         <w:t xml:space="preserve"> 1.80 EUR</w:t>
       </w:r>
     </w:p>
@@ -412,6 +494,7 @@
           <w:sz w:val="40"/>
           <w:szCs w:val="40"/>
         </w:rPr>
+        <w:lastRenderedPageBreak/>
         <w:t>Soft drinks</w:t>
       </w:r>
     </w:p>
@@ -614,316 +697,6 @@
         </w:rPr>
         <w:tab/>
         <w:t xml:space="preserve"> 0.80 EUR</w:t>
-      </w:r>
-      <w:r>
-        <w:br w:type="page"/>
-      </w:r>
-    </w:p>
-    <w:p>
-      <w:pPr>
-        <w:tabs>
-          <w:tab w:val="right" w:leader="dot" w:pos="8505"/>
-        </w:tabs>
-        <w:spacing w:line="360" w:lineRule="auto"/>
-        <w:rPr>
-          <w:rFonts w:ascii="Noto Sans" w:hAnsi="Noto Sans"/>
-          <w:b/>
-          <w:bCs/>
-          <w:sz w:val="40"/>
-          <w:szCs w:val="40"/>
-        </w:rPr>
-      </w:pPr>
-      <w:proofErr w:type="spellStart"/>
-      <w:r>
-        <w:rPr>
-          <w:rFonts w:ascii="Noto Sans" w:hAnsi="Noto Sans"/>
-          <w:b/>
-          <w:bCs/>
-          <w:sz w:val="40"/>
-          <w:szCs w:val="40"/>
-        </w:rPr>
-        <w:t>Flavoured</w:t>
-      </w:r>
-      <w:proofErr w:type="spellEnd"/>
-      <w:r>
-        <w:rPr>
-          <w:rFonts w:ascii="Noto Sans" w:hAnsi="Noto Sans"/>
-          <w:b/>
-          <w:bCs/>
-          <w:sz w:val="40"/>
-          <w:szCs w:val="40"/>
-        </w:rPr>
-        <w:t xml:space="preserve"> Milk</w:t>
-      </w:r>
-    </w:p>
-    <w:p>
-      <w:pPr>
-        <w:tabs>
-          <w:tab w:val="right" w:leader="dot" w:pos="8505"/>
-        </w:tabs>
-        <w:spacing w:line="360" w:lineRule="auto"/>
-        <w:rPr>
-          <w:rFonts w:ascii="Noto Sans" w:hAnsi="Noto Sans"/>
-          <w:sz w:val="28"/>
-          <w:szCs w:val="28"/>
-        </w:rPr>
-      </w:pPr>
-    </w:p>
-    <w:p>
-      <w:pPr>
-        <w:tabs>
-          <w:tab w:val="right" w:leader="dot" w:pos="8505"/>
-        </w:tabs>
-        <w:spacing w:line="360" w:lineRule="auto"/>
-        <w:rPr>
-          <w:rFonts w:ascii="Noto Sans" w:hAnsi="Noto Sans"/>
-          <w:sz w:val="28"/>
-          <w:szCs w:val="28"/>
-        </w:rPr>
-      </w:pPr>
-      <w:proofErr w:type="spellStart"/>
-      <w:r>
-        <w:rPr>
-          <w:rFonts w:ascii="Noto Sans" w:hAnsi="Noto Sans"/>
-          <w:sz w:val="28"/>
-          <w:szCs w:val="28"/>
-        </w:rPr>
-        <w:t>Müllermilch</w:t>
-      </w:r>
-      <w:proofErr w:type="spellEnd"/>
-      <w:r>
-        <w:rPr>
-          <w:rFonts w:ascii="Noto Sans" w:hAnsi="Noto Sans"/>
-          <w:sz w:val="28"/>
-          <w:szCs w:val="28"/>
-        </w:rPr>
-        <w:t xml:space="preserve"> (400 ml)</w:t>
-      </w:r>
-    </w:p>
-    <w:p>
-      <w:pPr>
-        <w:numPr>
-          <w:ilvl w:val="0"/>
-          <w:numId w:val="2"/>
-        </w:numPr>
-        <w:tabs>
-          <w:tab w:val="clear" w:pos="720"/>
-          <w:tab w:val="right" w:leader="dot" w:pos="8505"/>
-        </w:tabs>
-        <w:spacing w:line="360" w:lineRule="auto"/>
-        <w:rPr>
-          <w:rFonts w:ascii="Noto Sans" w:hAnsi="Noto Sans"/>
-          <w:sz w:val="28"/>
-          <w:szCs w:val="28"/>
-        </w:rPr>
-      </w:pPr>
-      <w:r>
-        <w:rPr>
-          <w:rFonts w:ascii="Noto Sans" w:hAnsi="Noto Sans"/>
-          <w:sz w:val="28"/>
-          <w:szCs w:val="28"/>
-        </w:rPr>
-        <w:t xml:space="preserve">Chocolate </w:t>
-      </w:r>
-      <w:r>
-        <w:rPr>
-          <w:rFonts w:ascii="Noto Sans" w:hAnsi="Noto Sans"/>
-          <w:sz w:val="28"/>
-          <w:szCs w:val="28"/>
-        </w:rPr>
-        <w:tab/>
-        <w:t xml:space="preserve"> 1.20 EUR</w:t>
-      </w:r>
-    </w:p>
-    <w:p>
-      <w:pPr>
-        <w:numPr>
-          <w:ilvl w:val="0"/>
-          <w:numId w:val="2"/>
-        </w:numPr>
-        <w:tabs>
-          <w:tab w:val="clear" w:pos="720"/>
-          <w:tab w:val="right" w:leader="dot" w:pos="8505"/>
-        </w:tabs>
-        <w:spacing w:line="360" w:lineRule="auto"/>
-        <w:rPr>
-          <w:rFonts w:ascii="Noto Sans" w:hAnsi="Noto Sans"/>
-          <w:sz w:val="28"/>
-          <w:szCs w:val="28"/>
-        </w:rPr>
-      </w:pPr>
-      <w:r>
-        <w:rPr>
-          <w:rFonts w:ascii="Noto Sans" w:hAnsi="Noto Sans"/>
-          <w:sz w:val="28"/>
-          <w:szCs w:val="28"/>
-        </w:rPr>
-        <w:t xml:space="preserve">Strawberry </w:t>
-      </w:r>
-      <w:r>
-        <w:rPr>
-          <w:rFonts w:ascii="Noto Sans" w:hAnsi="Noto Sans"/>
-          <w:sz w:val="28"/>
-          <w:szCs w:val="28"/>
-        </w:rPr>
-        <w:tab/>
-        <w:t xml:space="preserve"> 1.20 EUR</w:t>
-      </w:r>
-    </w:p>
-    <w:p>
-      <w:pPr>
-        <w:numPr>
-          <w:ilvl w:val="0"/>
-          <w:numId w:val="2"/>
-        </w:numPr>
-        <w:tabs>
-          <w:tab w:val="clear" w:pos="720"/>
-          <w:tab w:val="right" w:leader="dot" w:pos="8505"/>
-        </w:tabs>
-        <w:spacing w:line="360" w:lineRule="auto"/>
-        <w:rPr>
-          <w:rFonts w:ascii="Noto Sans" w:hAnsi="Noto Sans"/>
-          <w:sz w:val="28"/>
-          <w:szCs w:val="28"/>
-        </w:rPr>
-      </w:pPr>
-      <w:r>
-        <w:rPr>
-          <w:rFonts w:ascii="Noto Sans" w:hAnsi="Noto Sans"/>
-          <w:sz w:val="28"/>
-          <w:szCs w:val="28"/>
-        </w:rPr>
-        <w:t xml:space="preserve">Banana </w:t>
-      </w:r>
-      <w:r>
-        <w:rPr>
-          <w:rFonts w:ascii="Noto Sans" w:hAnsi="Noto Sans"/>
-          <w:sz w:val="28"/>
-          <w:szCs w:val="28"/>
-        </w:rPr>
-        <w:tab/>
-        <w:t xml:space="preserve"> 1.20 EUR</w:t>
-      </w:r>
-      <w:r>
-        <w:rPr>
-          <w:rFonts w:ascii="Noto Sans" w:hAnsi="Noto Sans"/>
-          <w:sz w:val="28"/>
-          <w:szCs w:val="28"/>
-        </w:rPr>
-        <w:tab/>
-      </w:r>
-    </w:p>
-    <w:p>
-      <w:pPr>
-        <w:numPr>
-          <w:ilvl w:val="0"/>
-          <w:numId w:val="2"/>
-        </w:numPr>
-        <w:tabs>
-          <w:tab w:val="clear" w:pos="720"/>
-          <w:tab w:val="right" w:leader="dot" w:pos="8505"/>
-        </w:tabs>
-        <w:spacing w:line="360" w:lineRule="auto"/>
-        <w:rPr>
-          <w:rFonts w:ascii="Noto Sans" w:hAnsi="Noto Sans"/>
-          <w:sz w:val="28"/>
-          <w:szCs w:val="28"/>
-        </w:rPr>
-      </w:pPr>
-      <w:r>
-        <w:rPr>
-          <w:rFonts w:ascii="Noto Sans" w:hAnsi="Noto Sans"/>
-          <w:sz w:val="28"/>
-          <w:szCs w:val="28"/>
-        </w:rPr>
-        <w:t xml:space="preserve">Raspberry </w:t>
-      </w:r>
-      <w:r>
-        <w:rPr>
-          <w:rFonts w:ascii="Noto Sans" w:hAnsi="Noto Sans"/>
-          <w:sz w:val="28"/>
-          <w:szCs w:val="28"/>
-        </w:rPr>
-        <w:tab/>
-        <w:t xml:space="preserve"> 1.20 EUR</w:t>
-      </w:r>
-      <w:r>
-        <w:rPr>
-          <w:rFonts w:ascii="Noto Sans" w:hAnsi="Noto Sans"/>
-          <w:sz w:val="28"/>
-          <w:szCs w:val="28"/>
-        </w:rPr>
-        <w:tab/>
-      </w:r>
-    </w:p>
-    <w:p>
-      <w:pPr>
-        <w:numPr>
-          <w:ilvl w:val="0"/>
-          <w:numId w:val="2"/>
-        </w:numPr>
-        <w:tabs>
-          <w:tab w:val="clear" w:pos="720"/>
-          <w:tab w:val="right" w:leader="dot" w:pos="8505"/>
-        </w:tabs>
-        <w:spacing w:line="360" w:lineRule="auto"/>
-        <w:rPr>
-          <w:rFonts w:ascii="Noto Sans" w:hAnsi="Noto Sans"/>
-          <w:sz w:val="28"/>
-          <w:szCs w:val="28"/>
-        </w:rPr>
-      </w:pPr>
-      <w:r>
-        <w:rPr>
-          <w:rFonts w:ascii="Noto Sans" w:hAnsi="Noto Sans"/>
-          <w:sz w:val="28"/>
-          <w:szCs w:val="28"/>
-        </w:rPr>
-        <w:t xml:space="preserve">Chocolate Caramel Cookie </w:t>
-      </w:r>
-      <w:r>
-        <w:rPr>
-          <w:rFonts w:ascii="Noto Sans" w:hAnsi="Noto Sans"/>
-          <w:sz w:val="28"/>
-          <w:szCs w:val="28"/>
-        </w:rPr>
-        <w:tab/>
-        <w:t xml:space="preserve"> 1.20 EUR</w:t>
-      </w:r>
-    </w:p>
-    <w:p>
-      <w:pPr>
-        <w:numPr>
-          <w:ilvl w:val="0"/>
-          <w:numId w:val="2"/>
-        </w:numPr>
-        <w:tabs>
-          <w:tab w:val="clear" w:pos="720"/>
-          <w:tab w:val="right" w:leader="dot" w:pos="8505"/>
-        </w:tabs>
-        <w:spacing w:line="360" w:lineRule="auto"/>
-        <w:rPr>
-          <w:rFonts w:ascii="Noto Sans" w:hAnsi="Noto Sans"/>
-          <w:sz w:val="28"/>
-          <w:szCs w:val="28"/>
-        </w:rPr>
-      </w:pPr>
-      <w:r>
-        <w:rPr>
-          <w:rFonts w:ascii="Noto Sans" w:hAnsi="Noto Sans"/>
-          <w:sz w:val="28"/>
-          <w:szCs w:val="28"/>
-        </w:rPr>
-        <w:t xml:space="preserve">Hazelnut </w:t>
-      </w:r>
-      <w:r>
-        <w:rPr>
-          <w:rFonts w:ascii="Noto Sans" w:hAnsi="Noto Sans"/>
-          <w:sz w:val="28"/>
-          <w:szCs w:val="28"/>
-        </w:rPr>
-        <w:tab/>
-        <w:t xml:space="preserve"> 1.20 EUR</w:t>
       </w:r>
       <w:r>
         <w:br w:type="page"/>
@@ -948,315 +721,7 @@
           <w:sz w:val="40"/>
           <w:szCs w:val="40"/>
         </w:rPr>
-        <w:t>Chips</w:t>
-      </w:r>
-    </w:p>
-    <w:p>
-      <w:pPr>
-        <w:tabs>
-          <w:tab w:val="right" w:leader="dot" w:pos="8505"/>
-        </w:tabs>
-        <w:spacing w:line="360" w:lineRule="auto"/>
-        <w:rPr>
-          <w:rFonts w:ascii="Noto Sans" w:hAnsi="Noto Sans"/>
-          <w:sz w:val="28"/>
-          <w:szCs w:val="28"/>
-        </w:rPr>
-      </w:pPr>
-    </w:p>
-    <w:p>
-      <w:pPr>
-        <w:tabs>
-          <w:tab w:val="right" w:leader="dot" w:pos="8505"/>
-        </w:tabs>
-        <w:spacing w:line="360" w:lineRule="auto"/>
-        <w:rPr>
-          <w:rFonts w:ascii="Noto Sans" w:hAnsi="Noto Sans"/>
-          <w:sz w:val="28"/>
-          <w:szCs w:val="28"/>
-        </w:rPr>
-      </w:pPr>
-      <w:r>
-        <w:rPr>
-          <w:rFonts w:ascii="Noto Sans" w:hAnsi="Noto Sans"/>
-          <w:sz w:val="28"/>
-          <w:szCs w:val="28"/>
-        </w:rPr>
-        <w:t>Lay’s</w:t>
-      </w:r>
-      <w:r>
-        <w:rPr>
-          <w:rFonts w:ascii="Noto Sans" w:hAnsi="Noto Sans"/>
-          <w:sz w:val="28"/>
-          <w:szCs w:val="28"/>
-        </w:rPr>
-        <w:t xml:space="preserve"> Salted (60 g / 130 g) </w:t>
-      </w:r>
-      <w:r>
-        <w:rPr>
-          <w:rFonts w:ascii="Noto Sans" w:hAnsi="Noto Sans"/>
-          <w:sz w:val="28"/>
-          <w:szCs w:val="28"/>
-        </w:rPr>
-        <w:tab/>
-        <w:t xml:space="preserve"> 1.00 EUR / 1.60 EUR</w:t>
-      </w:r>
-    </w:p>
-    <w:p>
-      <w:pPr>
-        <w:tabs>
-          <w:tab w:val="right" w:leader="dot" w:pos="8505"/>
-        </w:tabs>
-        <w:spacing w:line="360" w:lineRule="auto"/>
-        <w:rPr>
-          <w:rFonts w:ascii="Noto Sans" w:hAnsi="Noto Sans"/>
-          <w:sz w:val="28"/>
-          <w:szCs w:val="28"/>
-        </w:rPr>
-      </w:pPr>
-      <w:r>
-        <w:rPr>
-          <w:rFonts w:ascii="Noto Sans" w:hAnsi="Noto Sans"/>
-          <w:sz w:val="28"/>
-          <w:szCs w:val="28"/>
-        </w:rPr>
-        <w:t>Lay’s</w:t>
-      </w:r>
-      <w:r>
-        <w:rPr>
-          <w:rFonts w:ascii="Noto Sans" w:hAnsi="Noto Sans"/>
-          <w:sz w:val="28"/>
-          <w:szCs w:val="28"/>
-        </w:rPr>
-        <w:t xml:space="preserve"> Fromage (60 g / 130 g) </w:t>
-      </w:r>
-      <w:r>
-        <w:rPr>
-          <w:rFonts w:ascii="Noto Sans" w:hAnsi="Noto Sans"/>
-          <w:sz w:val="28"/>
-          <w:szCs w:val="28"/>
-        </w:rPr>
-        <w:tab/>
-        <w:t xml:space="preserve"> 1.00 EUR / 1.60 EUR</w:t>
-      </w:r>
-    </w:p>
-    <w:p>
-      <w:pPr>
-        <w:tabs>
-          <w:tab w:val="right" w:leader="dot" w:pos="8505"/>
-        </w:tabs>
-        <w:spacing w:line="360" w:lineRule="auto"/>
-        <w:rPr>
-          <w:rFonts w:ascii="Noto Sans" w:hAnsi="Noto Sans"/>
-          <w:sz w:val="28"/>
-          <w:szCs w:val="28"/>
-        </w:rPr>
-      </w:pPr>
-      <w:r>
-        <w:rPr>
-          <w:rFonts w:ascii="Noto Sans" w:hAnsi="Noto Sans"/>
-          <w:sz w:val="28"/>
-          <w:szCs w:val="28"/>
-        </w:rPr>
-        <w:t>Lay’s</w:t>
-      </w:r>
-      <w:r>
-        <w:rPr>
-          <w:rFonts w:ascii="Noto Sans" w:hAnsi="Noto Sans"/>
-          <w:sz w:val="28"/>
-          <w:szCs w:val="28"/>
-        </w:rPr>
-        <w:t xml:space="preserve"> Cheese (60 g / 130 g) </w:t>
-      </w:r>
-      <w:r>
-        <w:rPr>
-          <w:rFonts w:ascii="Noto Sans" w:hAnsi="Noto Sans"/>
-          <w:sz w:val="28"/>
-          <w:szCs w:val="28"/>
-        </w:rPr>
-        <w:tab/>
-        <w:t xml:space="preserve"> 1.00 EUR / 1.60 EUR</w:t>
-      </w:r>
-    </w:p>
-    <w:p>
-      <w:pPr>
-        <w:tabs>
-          <w:tab w:val="right" w:leader="dot" w:pos="8505"/>
-        </w:tabs>
-        <w:spacing w:line="360" w:lineRule="auto"/>
-        <w:rPr>
-          <w:rFonts w:ascii="Noto Sans" w:hAnsi="Noto Sans"/>
-          <w:sz w:val="28"/>
-          <w:szCs w:val="28"/>
-        </w:rPr>
-      </w:pPr>
-      <w:r>
-        <w:rPr>
-          <w:rFonts w:ascii="Noto Sans" w:hAnsi="Noto Sans"/>
-          <w:sz w:val="28"/>
-          <w:szCs w:val="28"/>
-        </w:rPr>
-        <w:t xml:space="preserve">Lay's Piquant Paprika (60 g / 130 g) </w:t>
-      </w:r>
-      <w:r>
-        <w:rPr>
-          <w:rFonts w:ascii="Noto Sans" w:hAnsi="Noto Sans"/>
-          <w:sz w:val="28"/>
-          <w:szCs w:val="28"/>
-        </w:rPr>
-        <w:tab/>
-        <w:t xml:space="preserve"> 1.00 EUR / 1.60 EUR</w:t>
-      </w:r>
-      <w:r>
-        <w:br w:type="page"/>
-      </w:r>
-    </w:p>
-    <w:p>
-      <w:pPr>
-        <w:rPr>
-          <w:rFonts w:ascii="Noto Sans" w:hAnsi="Noto Sans"/>
-          <w:b/>
-          <w:bCs/>
-          <w:sz w:val="40"/>
-          <w:szCs w:val="40"/>
-        </w:rPr>
-      </w:pPr>
-      <w:r>
-        <w:rPr>
-          <w:rFonts w:ascii="Noto Sans" w:hAnsi="Noto Sans"/>
-          <w:b/>
-          <w:bCs/>
-          <w:sz w:val="40"/>
-          <w:szCs w:val="40"/>
-        </w:rPr>
-        <w:t>Fast Food</w:t>
-      </w:r>
-    </w:p>
-    <w:p>
-      <w:pPr>
-        <w:tabs>
-          <w:tab w:val="right" w:leader="dot" w:pos="8505"/>
-        </w:tabs>
-        <w:spacing w:line="360" w:lineRule="auto"/>
-        <w:rPr>
-          <w:rFonts w:ascii="Noto Sans" w:hAnsi="Noto Sans"/>
-          <w:sz w:val="28"/>
-          <w:szCs w:val="28"/>
-        </w:rPr>
-      </w:pPr>
-    </w:p>
-    <w:p>
-      <w:pPr>
-        <w:tabs>
-          <w:tab w:val="right" w:leader="dot" w:pos="8505"/>
-        </w:tabs>
-        <w:spacing w:line="360" w:lineRule="auto"/>
-        <w:rPr>
-          <w:rFonts w:ascii="Noto Sans" w:hAnsi="Noto Sans"/>
-          <w:sz w:val="28"/>
-          <w:szCs w:val="28"/>
-        </w:rPr>
-      </w:pPr>
-      <w:r>
-        <w:rPr>
-          <w:rFonts w:ascii="Noto Sans" w:hAnsi="Noto Sans"/>
-          <w:sz w:val="28"/>
-          <w:szCs w:val="28"/>
-        </w:rPr>
-        <w:t xml:space="preserve">Hamburger / Cheeseburger (150 g) </w:t>
-      </w:r>
-      <w:r>
-        <w:rPr>
-          <w:rFonts w:ascii="Noto Sans" w:hAnsi="Noto Sans"/>
-          <w:sz w:val="28"/>
-          <w:szCs w:val="28"/>
-        </w:rPr>
-        <w:tab/>
-        <w:t xml:space="preserve"> 3.20 EUR</w:t>
-      </w:r>
-    </w:p>
-    <w:p>
-      <w:pPr>
-        <w:tabs>
-          <w:tab w:val="right" w:leader="dot" w:pos="8505"/>
-        </w:tabs>
-        <w:spacing w:line="360" w:lineRule="auto"/>
-        <w:rPr>
-          <w:rFonts w:ascii="Noto Sans" w:hAnsi="Noto Sans"/>
-          <w:sz w:val="28"/>
-          <w:szCs w:val="28"/>
-        </w:rPr>
-      </w:pPr>
-      <w:r>
-        <w:rPr>
-          <w:rFonts w:ascii="Noto Sans" w:hAnsi="Noto Sans"/>
-          <w:sz w:val="28"/>
-          <w:szCs w:val="28"/>
-        </w:rPr>
-        <w:t>Fries (small, 80 g)</w:t>
-      </w:r>
-      <w:r>
-        <w:rPr>
-          <w:rFonts w:ascii="Noto Sans" w:hAnsi="Noto Sans"/>
-          <w:sz w:val="28"/>
-          <w:szCs w:val="28"/>
-        </w:rPr>
-        <w:tab/>
-        <w:t xml:space="preserve"> 1.80 EUR</w:t>
-      </w:r>
-    </w:p>
-    <w:p>
-      <w:pPr>
-        <w:tabs>
-          <w:tab w:val="right" w:leader="dot" w:pos="8505"/>
-        </w:tabs>
-        <w:spacing w:line="360" w:lineRule="auto"/>
-        <w:rPr>
-          <w:rFonts w:ascii="Noto Sans" w:hAnsi="Noto Sans"/>
-          <w:sz w:val="28"/>
-          <w:szCs w:val="28"/>
-        </w:rPr>
-      </w:pPr>
-      <w:r>
-        <w:rPr>
-          <w:rFonts w:ascii="Noto Sans" w:hAnsi="Noto Sans"/>
-          <w:sz w:val="28"/>
-          <w:szCs w:val="28"/>
-        </w:rPr>
-        <w:t xml:space="preserve">Fries (big, 130 g) </w:t>
-      </w:r>
-      <w:r>
-        <w:rPr>
-          <w:rFonts w:ascii="Noto Sans" w:hAnsi="Noto Sans"/>
-          <w:sz w:val="28"/>
-          <w:szCs w:val="28"/>
-        </w:rPr>
-        <w:tab/>
-        <w:t xml:space="preserve"> 2.40 EUR</w:t>
-      </w:r>
-      <w:r>
-        <w:br w:type="page"/>
-      </w:r>
-    </w:p>
-    <w:p>
-      <w:pPr>
-        <w:tabs>
-          <w:tab w:val="right" w:leader="dot" w:pos="8505"/>
-        </w:tabs>
-        <w:spacing w:line="360" w:lineRule="auto"/>
-        <w:rPr>
-          <w:rFonts w:ascii="Noto Sans" w:hAnsi="Noto Sans"/>
-        </w:rPr>
-      </w:pPr>
-      <w:r>
-        <w:rPr>
-          <w:rFonts w:ascii="Noto Sans" w:hAnsi="Noto Sans"/>
-          <w:b/>
-          <w:bCs/>
-          <w:color w:val="000000"/>
-          <w:sz w:val="40"/>
-          <w:szCs w:val="40"/>
-        </w:rPr>
+        <w:lastRenderedPageBreak/>
         <w:t>Cakes</w:t>
       </w:r>
     </w:p>
@@ -1329,413 +794,6 @@
         </w:rPr>
         <w:tab/>
         <w:t xml:space="preserve"> 0.50 EUR</w:t>
-      </w:r>
-      <w:r>
-        <w:br w:type="page"/>
-      </w:r>
-    </w:p>
-    <w:p>
-      <w:pPr>
-        <w:tabs>
-          <w:tab w:val="right" w:leader="dot" w:pos="8505"/>
-        </w:tabs>
-        <w:spacing w:line="360" w:lineRule="auto"/>
-        <w:rPr>
-          <w:rFonts w:ascii="Noto Sans" w:hAnsi="Noto Sans"/>
-        </w:rPr>
-      </w:pPr>
-      <w:proofErr w:type="spellStart"/>
-      <w:r>
-        <w:rPr>
-          <w:rFonts w:ascii="Noto Sans" w:hAnsi="Noto Sans"/>
-          <w:b/>
-          <w:bCs/>
-          <w:color w:val="000000"/>
-          <w:sz w:val="40"/>
-          <w:szCs w:val="40"/>
-          <w:lang w:val="cs-CZ"/>
-        </w:rPr>
-        <w:t>Ice</w:t>
-      </w:r>
-      <w:proofErr w:type="spellEnd"/>
-      <w:r>
-        <w:rPr>
-          <w:rFonts w:ascii="Noto Sans" w:hAnsi="Noto Sans"/>
-          <w:b/>
-          <w:bCs/>
-          <w:color w:val="000000"/>
-          <w:sz w:val="40"/>
-          <w:szCs w:val="40"/>
-          <w:lang w:val="cs-CZ"/>
-        </w:rPr>
-        <w:t xml:space="preserve"> </w:t>
-      </w:r>
-      <w:proofErr w:type="spellStart"/>
-      <w:r>
-        <w:rPr>
-          <w:rFonts w:ascii="Noto Sans" w:hAnsi="Noto Sans"/>
-          <w:b/>
-          <w:bCs/>
-          <w:color w:val="000000"/>
-          <w:sz w:val="40"/>
-          <w:szCs w:val="40"/>
-          <w:lang w:val="cs-CZ"/>
-        </w:rPr>
-        <w:t>Creams</w:t>
-      </w:r>
-      <w:proofErr w:type="spellEnd"/>
-    </w:p>
-    <w:p>
-      <w:pPr>
-        <w:tabs>
-          <w:tab w:val="right" w:leader="dot" w:pos="8505"/>
-        </w:tabs>
-        <w:spacing w:line="360" w:lineRule="auto"/>
-        <w:rPr>
-          <w:rFonts w:ascii="Noto Sans" w:hAnsi="Noto Sans"/>
-          <w:b/>
-          <w:bCs/>
-          <w:sz w:val="28"/>
-          <w:szCs w:val="28"/>
-          <w:lang w:val="cs-CZ"/>
-        </w:rPr>
-      </w:pPr>
-    </w:p>
-    <w:p>
-      <w:pPr>
-        <w:tabs>
-          <w:tab w:val="right" w:leader="dot" w:pos="8505"/>
-        </w:tabs>
-        <w:spacing w:line="360" w:lineRule="auto"/>
-        <w:rPr>
-          <w:rFonts w:ascii="Noto Sans" w:hAnsi="Noto Sans"/>
-          <w:sz w:val="28"/>
-          <w:szCs w:val="28"/>
-          <w:lang w:val="cs-CZ"/>
-        </w:rPr>
-      </w:pPr>
-      <w:proofErr w:type="spellStart"/>
-      <w:r>
-        <w:rPr>
-          <w:rFonts w:ascii="Noto Sans" w:hAnsi="Noto Sans"/>
-          <w:sz w:val="28"/>
-          <w:szCs w:val="28"/>
-          <w:lang w:val="cs-CZ"/>
-        </w:rPr>
-        <w:t>Häagen-Dazs</w:t>
-      </w:r>
-      <w:proofErr w:type="spellEnd"/>
-    </w:p>
-    <w:p>
-      <w:pPr>
-        <w:numPr>
-          <w:ilvl w:val="0"/>
-          <w:numId w:val="1"/>
-        </w:numPr>
-        <w:tabs>
-          <w:tab w:val="clear" w:pos="720"/>
-          <w:tab w:val="right" w:leader="dot" w:pos="8505"/>
-        </w:tabs>
-        <w:spacing w:line="360" w:lineRule="auto"/>
-        <w:rPr>
-          <w:rFonts w:ascii="Noto Sans" w:hAnsi="Noto Sans"/>
-          <w:sz w:val="28"/>
-          <w:szCs w:val="28"/>
-          <w:lang w:val="cs-CZ"/>
-        </w:rPr>
-      </w:pPr>
-      <w:proofErr w:type="spellStart"/>
-      <w:r>
-        <w:rPr>
-          <w:rFonts w:ascii="Noto Sans" w:hAnsi="Noto Sans"/>
-          <w:sz w:val="28"/>
-          <w:szCs w:val="28"/>
-          <w:lang w:val="cs-CZ"/>
-        </w:rPr>
-        <w:t>Salted</w:t>
-      </w:r>
-      <w:proofErr w:type="spellEnd"/>
-      <w:r>
-        <w:rPr>
-          <w:rFonts w:ascii="Noto Sans" w:hAnsi="Noto Sans"/>
-          <w:sz w:val="28"/>
-          <w:szCs w:val="28"/>
-          <w:lang w:val="cs-CZ"/>
-        </w:rPr>
-        <w:t xml:space="preserve"> </w:t>
-      </w:r>
-      <w:proofErr w:type="spellStart"/>
-      <w:r>
-        <w:rPr>
-          <w:rFonts w:ascii="Noto Sans" w:hAnsi="Noto Sans"/>
-          <w:sz w:val="28"/>
-          <w:szCs w:val="28"/>
-          <w:lang w:val="cs-CZ"/>
-        </w:rPr>
-        <w:t>Caramel</w:t>
-      </w:r>
-      <w:proofErr w:type="spellEnd"/>
-      <w:r>
-        <w:rPr>
-          <w:rFonts w:ascii="Noto Sans" w:hAnsi="Noto Sans"/>
-          <w:sz w:val="28"/>
-          <w:szCs w:val="28"/>
-          <w:lang w:val="cs-CZ"/>
-        </w:rPr>
-        <w:t xml:space="preserve"> (460 ml)</w:t>
-      </w:r>
-      <w:r>
-        <w:rPr>
-          <w:rFonts w:ascii="Noto Sans" w:hAnsi="Noto Sans"/>
-          <w:sz w:val="28"/>
-          <w:szCs w:val="28"/>
-          <w:lang w:val="cs-CZ"/>
-        </w:rPr>
-        <w:tab/>
-        <w:t xml:space="preserve"> 8.00 EUR</w:t>
-      </w:r>
-    </w:p>
-    <w:p>
-      <w:pPr>
-        <w:numPr>
-          <w:ilvl w:val="0"/>
-          <w:numId w:val="1"/>
-        </w:numPr>
-        <w:tabs>
-          <w:tab w:val="clear" w:pos="720"/>
-          <w:tab w:val="right" w:leader="dot" w:pos="8505"/>
-        </w:tabs>
-        <w:spacing w:line="360" w:lineRule="auto"/>
-        <w:rPr>
-          <w:rFonts w:ascii="Noto Sans" w:hAnsi="Noto Sans"/>
-        </w:rPr>
-      </w:pPr>
-      <w:proofErr w:type="spellStart"/>
-      <w:r>
-        <w:rPr>
-          <w:rFonts w:ascii="Noto Sans" w:hAnsi="Noto Sans"/>
-          <w:sz w:val="28"/>
-          <w:szCs w:val="28"/>
-          <w:lang w:val="cs-CZ"/>
-        </w:rPr>
-        <w:t>Strawberies</w:t>
-      </w:r>
-      <w:proofErr w:type="spellEnd"/>
-      <w:r>
-        <w:rPr>
-          <w:rFonts w:ascii="Noto Sans" w:hAnsi="Noto Sans"/>
-          <w:sz w:val="28"/>
-          <w:szCs w:val="28"/>
-          <w:lang w:val="cs-CZ"/>
-        </w:rPr>
-        <w:t xml:space="preserve"> and </w:t>
-      </w:r>
-      <w:proofErr w:type="spellStart"/>
-      <w:r>
-        <w:rPr>
-          <w:rFonts w:ascii="Noto Sans" w:hAnsi="Noto Sans"/>
-          <w:sz w:val="28"/>
-          <w:szCs w:val="28"/>
-          <w:lang w:val="cs-CZ"/>
-        </w:rPr>
-        <w:t>Cream</w:t>
-      </w:r>
-      <w:proofErr w:type="spellEnd"/>
-      <w:r>
-        <w:rPr>
-          <w:rFonts w:ascii="Noto Sans" w:hAnsi="Noto Sans"/>
-          <w:sz w:val="28"/>
-          <w:szCs w:val="28"/>
-          <w:lang w:val="cs-CZ"/>
-        </w:rPr>
-        <w:t xml:space="preserve"> (460 ml)</w:t>
-      </w:r>
-      <w:r>
-        <w:rPr>
-          <w:rFonts w:ascii="Noto Sans" w:hAnsi="Noto Sans"/>
-          <w:sz w:val="28"/>
-          <w:szCs w:val="28"/>
-          <w:lang w:val="cs-CZ"/>
-        </w:rPr>
-        <w:tab/>
-        <w:t xml:space="preserve"> 8.00 EUR</w:t>
-      </w:r>
-    </w:p>
-    <w:p>
-      <w:pPr>
-        <w:numPr>
-          <w:ilvl w:val="0"/>
-          <w:numId w:val="1"/>
-        </w:numPr>
-        <w:tabs>
-          <w:tab w:val="clear" w:pos="720"/>
-          <w:tab w:val="right" w:leader="dot" w:pos="8505"/>
-        </w:tabs>
-        <w:spacing w:line="360" w:lineRule="auto"/>
-        <w:rPr>
-          <w:rFonts w:ascii="Noto Sans" w:hAnsi="Noto Sans"/>
-        </w:rPr>
-      </w:pPr>
-      <w:proofErr w:type="spellStart"/>
-      <w:r>
-        <w:rPr>
-          <w:rFonts w:ascii="Noto Sans" w:hAnsi="Noto Sans"/>
-          <w:sz w:val="28"/>
-          <w:szCs w:val="28"/>
-          <w:lang w:val="cs-CZ"/>
-        </w:rPr>
-        <w:t>Vanilla</w:t>
-      </w:r>
-      <w:proofErr w:type="spellEnd"/>
-      <w:r>
-        <w:rPr>
-          <w:rFonts w:ascii="Noto Sans" w:hAnsi="Noto Sans"/>
-          <w:sz w:val="28"/>
-          <w:szCs w:val="28"/>
-          <w:lang w:val="cs-CZ"/>
-        </w:rPr>
-        <w:tab/>
-        <w:t xml:space="preserve"> 8.00 EUR</w:t>
-      </w:r>
-    </w:p>
-    <w:p>
-      <w:pPr>
-        <w:numPr>
-          <w:ilvl w:val="0"/>
-          <w:numId w:val="1"/>
-        </w:numPr>
-        <w:tabs>
-          <w:tab w:val="clear" w:pos="720"/>
-          <w:tab w:val="right" w:leader="dot" w:pos="8505"/>
-        </w:tabs>
-        <w:spacing w:line="360" w:lineRule="auto"/>
-        <w:rPr>
-          <w:rFonts w:ascii="Noto Sans" w:hAnsi="Noto Sans"/>
-        </w:rPr>
-      </w:pPr>
-      <w:r>
-        <w:rPr>
-          <w:rFonts w:ascii="Noto Sans" w:hAnsi="Noto Sans"/>
-          <w:sz w:val="28"/>
-          <w:szCs w:val="28"/>
-          <w:lang w:val="cs-CZ"/>
-        </w:rPr>
-        <w:t xml:space="preserve">Mango and </w:t>
-      </w:r>
-      <w:proofErr w:type="spellStart"/>
-      <w:r>
-        <w:rPr>
-          <w:rFonts w:ascii="Noto Sans" w:hAnsi="Noto Sans"/>
-          <w:sz w:val="28"/>
-          <w:szCs w:val="28"/>
-          <w:lang w:val="cs-CZ"/>
-        </w:rPr>
-        <w:t>Raspberry</w:t>
-      </w:r>
-      <w:proofErr w:type="spellEnd"/>
-      <w:r>
-        <w:rPr>
-          <w:rFonts w:ascii="Noto Sans" w:hAnsi="Noto Sans"/>
-          <w:sz w:val="28"/>
-          <w:szCs w:val="28"/>
-          <w:lang w:val="cs-CZ"/>
-        </w:rPr>
-        <w:tab/>
-        <w:t xml:space="preserve"> 8.00 EUR</w:t>
-      </w:r>
-    </w:p>
-    <w:p>
-      <w:pPr>
-        <w:numPr>
-          <w:ilvl w:val="0"/>
-          <w:numId w:val="1"/>
-        </w:numPr>
-        <w:tabs>
-          <w:tab w:val="clear" w:pos="720"/>
-          <w:tab w:val="right" w:leader="dot" w:pos="8505"/>
-        </w:tabs>
-        <w:spacing w:line="360" w:lineRule="auto"/>
-        <w:rPr>
-          <w:rFonts w:ascii="Noto Sans" w:hAnsi="Noto Sans"/>
-        </w:rPr>
-      </w:pPr>
-      <w:proofErr w:type="spellStart"/>
-      <w:r>
-        <w:rPr>
-          <w:rFonts w:ascii="Noto Sans" w:hAnsi="Noto Sans"/>
-          <w:sz w:val="28"/>
-          <w:szCs w:val="28"/>
-          <w:lang w:val="cs-CZ"/>
-        </w:rPr>
-        <w:t>Blueberries</w:t>
-      </w:r>
-      <w:proofErr w:type="spellEnd"/>
-      <w:r>
-        <w:rPr>
-          <w:rFonts w:ascii="Noto Sans" w:hAnsi="Noto Sans"/>
-          <w:sz w:val="28"/>
-          <w:szCs w:val="28"/>
-          <w:lang w:val="cs-CZ"/>
-        </w:rPr>
-        <w:t xml:space="preserve"> and </w:t>
-      </w:r>
-      <w:proofErr w:type="spellStart"/>
-      <w:r>
-        <w:rPr>
-          <w:rFonts w:ascii="Noto Sans" w:hAnsi="Noto Sans"/>
-          <w:sz w:val="28"/>
-          <w:szCs w:val="28"/>
-          <w:lang w:val="cs-CZ"/>
-        </w:rPr>
-        <w:t>Cream</w:t>
-      </w:r>
-      <w:proofErr w:type="spellEnd"/>
-      <w:r>
-        <w:rPr>
-          <w:rFonts w:ascii="Noto Sans" w:hAnsi="Noto Sans"/>
-          <w:sz w:val="28"/>
-          <w:szCs w:val="28"/>
-          <w:lang w:val="cs-CZ"/>
-        </w:rPr>
-        <w:tab/>
-        <w:t xml:space="preserve"> 8.00 EUR</w:t>
-      </w:r>
-    </w:p>
-    <w:p>
-      <w:pPr>
-        <w:numPr>
-          <w:ilvl w:val="0"/>
-          <w:numId w:val="1"/>
-        </w:numPr>
-        <w:tabs>
-          <w:tab w:val="clear" w:pos="720"/>
-          <w:tab w:val="right" w:leader="dot" w:pos="8505"/>
-        </w:tabs>
-        <w:spacing w:line="360" w:lineRule="auto"/>
-        <w:rPr>
-          <w:rFonts w:ascii="Noto Sans" w:hAnsi="Noto Sans"/>
-        </w:rPr>
-      </w:pPr>
-      <w:proofErr w:type="spellStart"/>
-      <w:r>
-        <w:rPr>
-          <w:rFonts w:ascii="Noto Sans" w:hAnsi="Noto Sans"/>
-          <w:sz w:val="28"/>
-          <w:szCs w:val="28"/>
-          <w:lang w:val="cs-CZ"/>
-        </w:rPr>
-        <w:t>Coffee</w:t>
-      </w:r>
-      <w:proofErr w:type="spellEnd"/>
-      <w:r>
-        <w:rPr>
-          <w:rFonts w:ascii="Noto Sans" w:hAnsi="Noto Sans"/>
-          <w:sz w:val="28"/>
-          <w:szCs w:val="28"/>
-          <w:lang w:val="cs-CZ"/>
-        </w:rPr>
-        <w:tab/>
-        <w:t xml:space="preserve"> 8.00 EUR</w:t>
       </w:r>
     </w:p>
     <w:sectPr>
@@ -2598,15 +1656,15 @@
     <w:lsdException w:name="Unresolved Mention" w:semiHidden="1" w:unhideWhenUsed="1"/>
     <w:lsdException w:name="Smart Link" w:semiHidden="1" w:unhideWhenUsed="1"/>
   </w:latentStyles>
-  <w:style w:type="paragraph" w:default="1" w:styleId="Normal">
+  <w:style w:type="paragraph" w:default="1" w:styleId="Normln">
     <w:name w:val="Normal"/>
     <w:qFormat/>
   </w:style>
-  <w:style w:type="paragraph" w:styleId="Heading1">
+  <w:style w:type="paragraph" w:styleId="Nadpis1">
     <w:name w:val="heading 1"/>
-    <w:basedOn w:val="Normal"/>
-    <w:next w:val="Normal"/>
-    <w:link w:val="Heading1Char"/>
+    <w:basedOn w:val="Normln"/>
+    <w:next w:val="Normln"/>
+    <w:link w:val="Nadpis1Char"/>
     <w:uiPriority w:val="9"/>
     <w:qFormat/>
     <w:rsid w:val="00233D7B"/>
@@ -2623,11 +1681,11 @@
       <w:szCs w:val="40"/>
     </w:rPr>
   </w:style>
-  <w:style w:type="paragraph" w:styleId="Heading2">
+  <w:style w:type="paragraph" w:styleId="Nadpis2">
     <w:name w:val="heading 2"/>
-    <w:basedOn w:val="Normal"/>
-    <w:next w:val="Normal"/>
-    <w:link w:val="Heading2Char"/>
+    <w:basedOn w:val="Normln"/>
+    <w:next w:val="Normln"/>
+    <w:link w:val="Nadpis2Char"/>
     <w:uiPriority w:val="9"/>
     <w:semiHidden/>
     <w:unhideWhenUsed/>
@@ -2646,11 +1704,11 @@
       <w:szCs w:val="32"/>
     </w:rPr>
   </w:style>
-  <w:style w:type="paragraph" w:styleId="Heading3">
+  <w:style w:type="paragraph" w:styleId="Nadpis3">
     <w:name w:val="heading 3"/>
-    <w:basedOn w:val="Normal"/>
-    <w:next w:val="Normal"/>
-    <w:link w:val="Heading3Char"/>
+    <w:basedOn w:val="Normln"/>
+    <w:next w:val="Normln"/>
+    <w:link w:val="Nadpis3Char"/>
     <w:uiPriority w:val="9"/>
     <w:semiHidden/>
     <w:unhideWhenUsed/>
@@ -2669,11 +1727,11 @@
       <w:szCs w:val="28"/>
     </w:rPr>
   </w:style>
-  <w:style w:type="paragraph" w:styleId="Heading4">
+  <w:style w:type="paragraph" w:styleId="Nadpis4">
     <w:name w:val="heading 4"/>
-    <w:basedOn w:val="Normal"/>
-    <w:next w:val="Normal"/>
-    <w:link w:val="Heading4Char"/>
+    <w:basedOn w:val="Normln"/>
+    <w:next w:val="Normln"/>
+    <w:link w:val="Nadpis4Char"/>
     <w:uiPriority w:val="9"/>
     <w:semiHidden/>
     <w:unhideWhenUsed/>
@@ -2692,11 +1750,11 @@
       <w:color w:val="0F4761" w:themeColor="accent1" w:themeShade="BF"/>
     </w:rPr>
   </w:style>
-  <w:style w:type="paragraph" w:styleId="Heading5">
+  <w:style w:type="paragraph" w:styleId="Nadpis5">
     <w:name w:val="heading 5"/>
-    <w:basedOn w:val="Normal"/>
-    <w:next w:val="Normal"/>
-    <w:link w:val="Heading5Char"/>
+    <w:basedOn w:val="Normln"/>
+    <w:next w:val="Normln"/>
+    <w:link w:val="Nadpis5Char"/>
     <w:uiPriority w:val="9"/>
     <w:semiHidden/>
     <w:unhideWhenUsed/>
@@ -2713,11 +1771,11 @@
       <w:color w:val="0F4761" w:themeColor="accent1" w:themeShade="BF"/>
     </w:rPr>
   </w:style>
-  <w:style w:type="paragraph" w:styleId="Heading6">
+  <w:style w:type="paragraph" w:styleId="Nadpis6">
     <w:name w:val="heading 6"/>
-    <w:basedOn w:val="Normal"/>
-    <w:next w:val="Normal"/>
-    <w:link w:val="Heading6Char"/>
+    <w:basedOn w:val="Normln"/>
+    <w:next w:val="Normln"/>
+    <w:link w:val="Nadpis6Char"/>
     <w:uiPriority w:val="9"/>
     <w:semiHidden/>
     <w:unhideWhenUsed/>
@@ -2736,11 +1794,11 @@
       <w:color w:val="595959" w:themeColor="text1" w:themeTint="A6"/>
     </w:rPr>
   </w:style>
-  <w:style w:type="paragraph" w:styleId="Heading7">
+  <w:style w:type="paragraph" w:styleId="Nadpis7">
     <w:name w:val="heading 7"/>
-    <w:basedOn w:val="Normal"/>
-    <w:next w:val="Normal"/>
-    <w:link w:val="Heading7Char"/>
+    <w:basedOn w:val="Normln"/>
+    <w:next w:val="Normln"/>
+    <w:link w:val="Nadpis7Char"/>
     <w:uiPriority w:val="9"/>
     <w:semiHidden/>
     <w:unhideWhenUsed/>
@@ -2757,11 +1815,11 @@
       <w:color w:val="595959" w:themeColor="text1" w:themeTint="A6"/>
     </w:rPr>
   </w:style>
-  <w:style w:type="paragraph" w:styleId="Heading8">
+  <w:style w:type="paragraph" w:styleId="Nadpis8">
     <w:name w:val="heading 8"/>
-    <w:basedOn w:val="Normal"/>
-    <w:next w:val="Normal"/>
-    <w:link w:val="Heading8Char"/>
+    <w:basedOn w:val="Normln"/>
+    <w:next w:val="Normln"/>
+    <w:link w:val="Nadpis8Char"/>
     <w:uiPriority w:val="9"/>
     <w:semiHidden/>
     <w:unhideWhenUsed/>
@@ -2779,11 +1837,11 @@
       <w:color w:val="272727" w:themeColor="text1" w:themeTint="D8"/>
     </w:rPr>
   </w:style>
-  <w:style w:type="paragraph" w:styleId="Heading9">
+  <w:style w:type="paragraph" w:styleId="Nadpis9">
     <w:name w:val="heading 9"/>
-    <w:basedOn w:val="Normal"/>
-    <w:next w:val="Normal"/>
-    <w:link w:val="Heading9Char"/>
+    <w:basedOn w:val="Normln"/>
+    <w:next w:val="Normln"/>
+    <w:link w:val="Nadpis9Char"/>
     <w:uiPriority w:val="9"/>
     <w:semiHidden/>
     <w:unhideWhenUsed/>
@@ -2799,13 +1857,13 @@
       <w:color w:val="272727" w:themeColor="text1" w:themeTint="D8"/>
     </w:rPr>
   </w:style>
-  <w:style w:type="character" w:default="1" w:styleId="DefaultParagraphFont">
+  <w:style w:type="character" w:default="1" w:styleId="Standardnpsmoodstavce">
     <w:name w:val="Default Paragraph Font"/>
     <w:uiPriority w:val="1"/>
     <w:semiHidden/>
     <w:unhideWhenUsed/>
   </w:style>
-  <w:style w:type="table" w:default="1" w:styleId="TableNormal">
+  <w:style w:type="table" w:default="1" w:styleId="Normlntabulka">
     <w:name w:val="Normal Table"/>
     <w:uiPriority w:val="99"/>
     <w:semiHidden/>
@@ -2820,16 +1878,16 @@
       </w:tblCellMar>
     </w:tblPr>
   </w:style>
-  <w:style w:type="numbering" w:default="1" w:styleId="NoList">
+  <w:style w:type="numbering" w:default="1" w:styleId="Bezseznamu">
     <w:name w:val="No List"/>
     <w:uiPriority w:val="99"/>
     <w:semiHidden/>
     <w:unhideWhenUsed/>
   </w:style>
-  <w:style w:type="character" w:customStyle="1" w:styleId="Heading1Char">
-    <w:name w:val="Heading 1 Char"/>
-    <w:basedOn w:val="DefaultParagraphFont"/>
-    <w:link w:val="Heading1"/>
+  <w:style w:type="character" w:customStyle="1" w:styleId="Nadpis1Char">
+    <w:name w:val="Nadpis 1 Char"/>
+    <w:basedOn w:val="Standardnpsmoodstavce"/>
+    <w:link w:val="Nadpis1"/>
     <w:uiPriority w:val="9"/>
     <w:qFormat/>
     <w:rsid w:val="00233D7B"/>
@@ -2840,10 +1898,10 @@
       <w:szCs w:val="40"/>
     </w:rPr>
   </w:style>
-  <w:style w:type="character" w:customStyle="1" w:styleId="Heading2Char">
-    <w:name w:val="Heading 2 Char"/>
-    <w:basedOn w:val="DefaultParagraphFont"/>
-    <w:link w:val="Heading2"/>
+  <w:style w:type="character" w:customStyle="1" w:styleId="Nadpis2Char">
+    <w:name w:val="Nadpis 2 Char"/>
+    <w:basedOn w:val="Standardnpsmoodstavce"/>
+    <w:link w:val="Nadpis2"/>
     <w:uiPriority w:val="9"/>
     <w:semiHidden/>
     <w:qFormat/>
@@ -2855,10 +1913,10 @@
       <w:szCs w:val="32"/>
     </w:rPr>
   </w:style>
-  <w:style w:type="character" w:customStyle="1" w:styleId="Heading3Char">
-    <w:name w:val="Heading 3 Char"/>
-    <w:basedOn w:val="DefaultParagraphFont"/>
-    <w:link w:val="Heading3"/>
+  <w:style w:type="character" w:customStyle="1" w:styleId="Nadpis3Char">
+    <w:name w:val="Nadpis 3 Char"/>
+    <w:basedOn w:val="Standardnpsmoodstavce"/>
+    <w:link w:val="Nadpis3"/>
     <w:uiPriority w:val="9"/>
     <w:semiHidden/>
     <w:qFormat/>
@@ -2870,10 +1928,10 @@
       <w:szCs w:val="28"/>
     </w:rPr>
   </w:style>
-  <w:style w:type="character" w:customStyle="1" w:styleId="Heading4Char">
-    <w:name w:val="Heading 4 Char"/>
-    <w:basedOn w:val="DefaultParagraphFont"/>
-    <w:link w:val="Heading4"/>
+  <w:style w:type="character" w:customStyle="1" w:styleId="Nadpis4Char">
+    <w:name w:val="Nadpis 4 Char"/>
+    <w:basedOn w:val="Standardnpsmoodstavce"/>
+    <w:link w:val="Nadpis4"/>
     <w:uiPriority w:val="9"/>
     <w:semiHidden/>
     <w:qFormat/>
@@ -2885,10 +1943,10 @@
       <w:color w:val="0F4761" w:themeColor="accent1" w:themeShade="BF"/>
     </w:rPr>
   </w:style>
-  <w:style w:type="character" w:customStyle="1" w:styleId="Heading5Char">
-    <w:name w:val="Heading 5 Char"/>
-    <w:basedOn w:val="DefaultParagraphFont"/>
-    <w:link w:val="Heading5"/>
+  <w:style w:type="character" w:customStyle="1" w:styleId="Nadpis5Char">
+    <w:name w:val="Nadpis 5 Char"/>
+    <w:basedOn w:val="Standardnpsmoodstavce"/>
+    <w:link w:val="Nadpis5"/>
     <w:uiPriority w:val="9"/>
     <w:semiHidden/>
     <w:qFormat/>
@@ -2898,10 +1956,10 @@
       <w:color w:val="0F4761" w:themeColor="accent1" w:themeShade="BF"/>
     </w:rPr>
   </w:style>
-  <w:style w:type="character" w:customStyle="1" w:styleId="Heading6Char">
-    <w:name w:val="Heading 6 Char"/>
-    <w:basedOn w:val="DefaultParagraphFont"/>
-    <w:link w:val="Heading6"/>
+  <w:style w:type="character" w:customStyle="1" w:styleId="Nadpis6Char">
+    <w:name w:val="Nadpis 6 Char"/>
+    <w:basedOn w:val="Standardnpsmoodstavce"/>
+    <w:link w:val="Nadpis6"/>
     <w:uiPriority w:val="9"/>
     <w:semiHidden/>
     <w:qFormat/>
@@ -2913,10 +1971,10 @@
       <w:color w:val="595959" w:themeColor="text1" w:themeTint="A6"/>
     </w:rPr>
   </w:style>
-  <w:style w:type="character" w:customStyle="1" w:styleId="Heading7Char">
-    <w:name w:val="Heading 7 Char"/>
-    <w:basedOn w:val="DefaultParagraphFont"/>
-    <w:link w:val="Heading7"/>
+  <w:style w:type="character" w:customStyle="1" w:styleId="Nadpis7Char">
+    <w:name w:val="Nadpis 7 Char"/>
+    <w:basedOn w:val="Standardnpsmoodstavce"/>
+    <w:link w:val="Nadpis7"/>
     <w:uiPriority w:val="9"/>
     <w:semiHidden/>
     <w:qFormat/>
@@ -2926,10 +1984,10 @@
       <w:color w:val="595959" w:themeColor="text1" w:themeTint="A6"/>
     </w:rPr>
   </w:style>
-  <w:style w:type="character" w:customStyle="1" w:styleId="Heading8Char">
-    <w:name w:val="Heading 8 Char"/>
-    <w:basedOn w:val="DefaultParagraphFont"/>
-    <w:link w:val="Heading8"/>
+  <w:style w:type="character" w:customStyle="1" w:styleId="Nadpis8Char">
+    <w:name w:val="Nadpis 8 Char"/>
+    <w:basedOn w:val="Standardnpsmoodstavce"/>
+    <w:link w:val="Nadpis8"/>
     <w:uiPriority w:val="9"/>
     <w:semiHidden/>
     <w:qFormat/>
@@ -2941,10 +1999,10 @@
       <w:color w:val="272727" w:themeColor="text1" w:themeTint="D8"/>
     </w:rPr>
   </w:style>
-  <w:style w:type="character" w:customStyle="1" w:styleId="Heading9Char">
-    <w:name w:val="Heading 9 Char"/>
-    <w:basedOn w:val="DefaultParagraphFont"/>
-    <w:link w:val="Heading9"/>
+  <w:style w:type="character" w:customStyle="1" w:styleId="Nadpis9Char">
+    <w:name w:val="Nadpis 9 Char"/>
+    <w:basedOn w:val="Standardnpsmoodstavce"/>
+    <w:link w:val="Nadpis9"/>
     <w:uiPriority w:val="9"/>
     <w:semiHidden/>
     <w:qFormat/>
@@ -2954,10 +2012,10 @@
       <w:color w:val="272727" w:themeColor="text1" w:themeTint="D8"/>
     </w:rPr>
   </w:style>
-  <w:style w:type="character" w:customStyle="1" w:styleId="TitleChar">
-    <w:name w:val="Title Char"/>
-    <w:basedOn w:val="DefaultParagraphFont"/>
-    <w:link w:val="Title"/>
+  <w:style w:type="character" w:customStyle="1" w:styleId="NzevChar">
+    <w:name w:val="Název Char"/>
+    <w:basedOn w:val="Standardnpsmoodstavce"/>
+    <w:link w:val="Nzev"/>
     <w:uiPriority w:val="10"/>
     <w:qFormat/>
     <w:rsid w:val="00233D7B"/>
@@ -2969,10 +2027,10 @@
       <w:szCs w:val="56"/>
     </w:rPr>
   </w:style>
-  <w:style w:type="character" w:customStyle="1" w:styleId="SubtitleChar">
-    <w:name w:val="Subtitle Char"/>
-    <w:basedOn w:val="DefaultParagraphFont"/>
-    <w:link w:val="Subtitle"/>
+  <w:style w:type="character" w:customStyle="1" w:styleId="PodnadpisChar">
+    <w:name w:val="Podnadpis Char"/>
+    <w:basedOn w:val="Standardnpsmoodstavce"/>
+    <w:link w:val="Podnadpis"/>
     <w:uiPriority w:val="11"/>
     <w:qFormat/>
     <w:rsid w:val="00233D7B"/>
@@ -2984,10 +2042,10 @@
       <w:szCs w:val="28"/>
     </w:rPr>
   </w:style>
-  <w:style w:type="character" w:customStyle="1" w:styleId="QuoteChar">
-    <w:name w:val="Quote Char"/>
-    <w:basedOn w:val="DefaultParagraphFont"/>
-    <w:link w:val="Quote"/>
+  <w:style w:type="character" w:customStyle="1" w:styleId="CittChar">
+    <w:name w:val="Citát Char"/>
+    <w:basedOn w:val="Standardnpsmoodstavce"/>
+    <w:link w:val="Citt"/>
     <w:uiPriority w:val="29"/>
     <w:qFormat/>
     <w:rsid w:val="00233D7B"/>
@@ -2997,9 +2055,9 @@
       <w:color w:val="404040" w:themeColor="text1" w:themeTint="BF"/>
     </w:rPr>
   </w:style>
-  <w:style w:type="character" w:styleId="IntenseEmphasis">
+  <w:style w:type="character" w:styleId="Zdraznnintenzivn">
     <w:name w:val="Intense Emphasis"/>
-    <w:basedOn w:val="DefaultParagraphFont"/>
+    <w:basedOn w:val="Standardnpsmoodstavce"/>
     <w:uiPriority w:val="21"/>
     <w:qFormat/>
     <w:rsid w:val="00233D7B"/>
@@ -3009,10 +2067,10 @@
       <w:color w:val="0F4761" w:themeColor="accent1" w:themeShade="BF"/>
     </w:rPr>
   </w:style>
-  <w:style w:type="character" w:customStyle="1" w:styleId="IntenseQuoteChar">
-    <w:name w:val="Intense Quote Char"/>
-    <w:basedOn w:val="DefaultParagraphFont"/>
-    <w:link w:val="IntenseQuote"/>
+  <w:style w:type="character" w:customStyle="1" w:styleId="VrazncittChar">
+    <w:name w:val="Výrazný citát Char"/>
+    <w:basedOn w:val="Standardnpsmoodstavce"/>
+    <w:link w:val="Vrazncitt"/>
     <w:uiPriority w:val="30"/>
     <w:qFormat/>
     <w:rsid w:val="00233D7B"/>
@@ -3022,9 +2080,9 @@
       <w:color w:val="0F4761" w:themeColor="accent1" w:themeShade="BF"/>
     </w:rPr>
   </w:style>
-  <w:style w:type="character" w:styleId="IntenseReference">
+  <w:style w:type="character" w:styleId="Odkazintenzivn">
     <w:name w:val="Intense Reference"/>
-    <w:basedOn w:val="DefaultParagraphFont"/>
+    <w:basedOn w:val="Standardnpsmoodstavce"/>
     <w:uiPriority w:val="32"/>
     <w:qFormat/>
     <w:rsid w:val="00233D7B"/>
@@ -3036,9 +2094,9 @@
       <w:spacing w:val="5"/>
     </w:rPr>
   </w:style>
-  <w:style w:type="character" w:styleId="Hyperlink">
+  <w:style w:type="character" w:styleId="Hypertextovodkaz">
     <w:name w:val="Hyperlink"/>
-    <w:basedOn w:val="DefaultParagraphFont"/>
+    <w:basedOn w:val="Standardnpsmoodstavce"/>
     <w:uiPriority w:val="99"/>
     <w:unhideWhenUsed/>
     <w:rsid w:val="00D87CC4"/>
@@ -3058,8 +2116,8 @@
   </w:style>
   <w:style w:type="paragraph" w:customStyle="1" w:styleId="Nadpis">
     <w:name w:val="Nadpis"/>
-    <w:basedOn w:val="Normal"/>
-    <w:next w:val="BodyText"/>
+    <w:basedOn w:val="Normln"/>
+    <w:next w:val="Zkladntext"/>
     <w:qFormat/>
     <w:pPr>
       <w:keepNext/>
@@ -3071,23 +2129,23 @@
       <w:szCs w:val="28"/>
     </w:rPr>
   </w:style>
-  <w:style w:type="paragraph" w:styleId="BodyText">
+  <w:style w:type="paragraph" w:styleId="Zkladntext">
     <w:name w:val="Body Text"/>
-    <w:basedOn w:val="Normal"/>
+    <w:basedOn w:val="Normln"/>
     <w:pPr>
       <w:spacing w:after="140" w:line="276" w:lineRule="auto"/>
     </w:pPr>
   </w:style>
-  <w:style w:type="paragraph" w:styleId="List">
+  <w:style w:type="paragraph" w:styleId="Seznam">
     <w:name w:val="List"/>
-    <w:basedOn w:val="BodyText"/>
+    <w:basedOn w:val="Zkladntext"/>
     <w:rPr>
       <w:rFonts w:cs="Arial"/>
     </w:rPr>
   </w:style>
-  <w:style w:type="paragraph" w:styleId="Caption">
+  <w:style w:type="paragraph" w:styleId="Titulek">
     <w:name w:val="caption"/>
-    <w:basedOn w:val="Normal"/>
+    <w:basedOn w:val="Normln"/>
     <w:qFormat/>
     <w:pPr>
       <w:suppressLineNumbers/>
@@ -3101,7 +2159,7 @@
   </w:style>
   <w:style w:type="paragraph" w:customStyle="1" w:styleId="Rejstk">
     <w:name w:val="Rejstřík"/>
-    <w:basedOn w:val="Normal"/>
+    <w:basedOn w:val="Normln"/>
     <w:qFormat/>
     <w:pPr>
       <w:suppressLineNumbers/>
@@ -3112,8 +2170,8 @@
   </w:style>
   <w:style w:type="paragraph" w:customStyle="1" w:styleId="Nadpisuser">
     <w:name w:val="Nadpis (user)"/>
-    <w:basedOn w:val="Normal"/>
-    <w:next w:val="BodyText"/>
+    <w:basedOn w:val="Normln"/>
+    <w:next w:val="Zkladntext"/>
     <w:qFormat/>
     <w:pPr>
       <w:keepNext/>
@@ -3127,7 +2185,7 @@
   </w:style>
   <w:style w:type="paragraph" w:customStyle="1" w:styleId="Rejstkuser">
     <w:name w:val="Rejstřík (user)"/>
-    <w:basedOn w:val="Normal"/>
+    <w:basedOn w:val="Normln"/>
     <w:qFormat/>
     <w:pPr>
       <w:suppressLineNumbers/>
@@ -3136,11 +2194,11 @@
       <w:rFonts w:cs="Arial"/>
     </w:rPr>
   </w:style>
-  <w:style w:type="paragraph" w:styleId="Title">
+  <w:style w:type="paragraph" w:styleId="Nzev">
     <w:name w:val="Title"/>
-    <w:basedOn w:val="Normal"/>
-    <w:next w:val="Normal"/>
-    <w:link w:val="TitleChar"/>
+    <w:basedOn w:val="Normln"/>
+    <w:next w:val="Normln"/>
+    <w:link w:val="NzevChar"/>
     <w:uiPriority w:val="10"/>
     <w:qFormat/>
     <w:rsid w:val="00233D7B"/>
@@ -3155,11 +2213,11 @@
       <w:szCs w:val="56"/>
     </w:rPr>
   </w:style>
-  <w:style w:type="paragraph" w:styleId="Subtitle">
+  <w:style w:type="paragraph" w:styleId="Podnadpis">
     <w:name w:val="Subtitle"/>
-    <w:basedOn w:val="Normal"/>
-    <w:next w:val="Normal"/>
-    <w:link w:val="SubtitleChar"/>
+    <w:basedOn w:val="Normln"/>
+    <w:next w:val="Normln"/>
+    <w:link w:val="PodnadpisChar"/>
     <w:uiPriority w:val="11"/>
     <w:qFormat/>
     <w:rsid w:val="00233D7B"/>
@@ -3174,11 +2232,11 @@
       <w:szCs w:val="28"/>
     </w:rPr>
   </w:style>
-  <w:style w:type="paragraph" w:styleId="Quote">
+  <w:style w:type="paragraph" w:styleId="Citt">
     <w:name w:val="Quote"/>
-    <w:basedOn w:val="Normal"/>
-    <w:next w:val="Normal"/>
-    <w:link w:val="QuoteChar"/>
+    <w:basedOn w:val="Normln"/>
+    <w:next w:val="Normln"/>
+    <w:link w:val="CittChar"/>
     <w:uiPriority w:val="29"/>
     <w:qFormat/>
     <w:rsid w:val="00233D7B"/>
@@ -3192,9 +2250,9 @@
       <w:color w:val="404040" w:themeColor="text1" w:themeTint="BF"/>
     </w:rPr>
   </w:style>
-  <w:style w:type="paragraph" w:styleId="ListParagraph">
+  <w:style w:type="paragraph" w:styleId="Odstavecseseznamem">
     <w:name w:val="List Paragraph"/>
-    <w:basedOn w:val="Normal"/>
+    <w:basedOn w:val="Normln"/>
     <w:uiPriority w:val="34"/>
     <w:qFormat/>
     <w:rsid w:val="00233D7B"/>
@@ -3203,11 +2261,11 @@
       <w:contextualSpacing/>
     </w:pPr>
   </w:style>
-  <w:style w:type="paragraph" w:styleId="IntenseQuote">
+  <w:style w:type="paragraph" w:styleId="Vrazncitt">
     <w:name w:val="Intense Quote"/>
-    <w:basedOn w:val="Normal"/>
-    <w:next w:val="Normal"/>
-    <w:link w:val="IntenseQuoteChar"/>
+    <w:basedOn w:val="Normln"/>
+    <w:next w:val="Normln"/>
+    <w:link w:val="VrazncittChar"/>
     <w:uiPriority w:val="30"/>
     <w:qFormat/>
     <w:rsid w:val="00233D7B"/>
@@ -3226,14 +2284,14 @@
       <w:color w:val="0F4761" w:themeColor="accent1" w:themeShade="BF"/>
     </w:rPr>
   </w:style>
-  <w:style w:type="paragraph" w:styleId="IndexHeading">
+  <w:style w:type="paragraph" w:styleId="Hlavikarejstku">
     <w:name w:val="index heading"/>
     <w:basedOn w:val="Nadpisuser"/>
   </w:style>
-  <w:style w:type="paragraph" w:styleId="TOCHeading">
+  <w:style w:type="paragraph" w:styleId="Nadpisobsahu">
     <w:name w:val="TOC Heading"/>
-    <w:basedOn w:val="Heading1"/>
-    <w:next w:val="Normal"/>
+    <w:basedOn w:val="Nadpis1"/>
+    <w:next w:val="Normln"/>
     <w:uiPriority w:val="39"/>
     <w:unhideWhenUsed/>
     <w:qFormat/>

</xml_diff>

<commit_message>
updated dining car menu, pages, readme, logo. website qr code, added screenshot
</commit_message>
<xml_diff>
--- a/documents/dining-car-menu.docx
+++ b/documents/dining-car-menu.docx
@@ -2,123 +2,433 @@
 <file path=word/document.xml><?xml version="1.0" encoding="utf-8"?>
 <w:document xmlns:wpc="http://schemas.microsoft.com/office/word/2010/wordprocessingCanvas" xmlns:cx="http://schemas.microsoft.com/office/drawing/2014/chartex" xmlns:cx1="http://schemas.microsoft.com/office/drawing/2015/9/8/chartex" xmlns:cx2="http://schemas.microsoft.com/office/drawing/2015/10/21/chartex" xmlns:cx3="http://schemas.microsoft.com/office/drawing/2016/5/9/chartex" xmlns:cx4="http://schemas.microsoft.com/office/drawing/2016/5/10/chartex" xmlns:cx5="http://schemas.microsoft.com/office/drawing/2016/5/11/chartex" xmlns:cx6="http://schemas.microsoft.com/office/drawing/2016/5/12/chartex" xmlns:cx7="http://schemas.microsoft.com/office/drawing/2016/5/13/chartex" xmlns:cx8="http://schemas.microsoft.com/office/drawing/2016/5/14/chartex" xmlns:mc="http://schemas.openxmlformats.org/markup-compatibility/2006" xmlns:aink="http://schemas.microsoft.com/office/drawing/2016/ink" xmlns:am3d="http://schemas.microsoft.com/office/drawing/2017/model3d" xmlns:o="urn:schemas-microsoft-com:office:office" xmlns:oel="http://schemas.microsoft.com/office/2019/extlst" xmlns:r="http://schemas.openxmlformats.org/officeDocument/2006/relationships" xmlns:m="http://schemas.openxmlformats.org/officeDocument/2006/math" xmlns:v="urn:schemas-microsoft-com:vml" xmlns:wp14="http://schemas.microsoft.com/office/word/2010/wordprocessingDrawing" xmlns:wp="http://schemas.openxmlformats.org/drawingml/2006/wordprocessingDrawing" xmlns:w10="urn:schemas-microsoft-com:office:word" xmlns:w="http://schemas.openxmlformats.org/wordprocessingml/2006/main" xmlns:w14="http://schemas.microsoft.com/office/word/2010/wordml" xmlns:w15="http://schemas.microsoft.com/office/word/2012/wordml" xmlns:w16cex="http://schemas.microsoft.com/office/word/2018/wordml/cex" xmlns:w16cid="http://schemas.microsoft.com/office/word/2016/wordml/cid" xmlns:w16="http://schemas.microsoft.com/office/word/2018/wordml" xmlns:w16du="http://schemas.microsoft.com/office/word/2023/wordml/word16du" xmlns:w16sdtdh="http://schemas.microsoft.com/office/word/2020/wordml/sdtdatahash" xmlns:w16sdtfl="http://schemas.microsoft.com/office/word/2024/wordml/sdtformatlock" xmlns:w16se="http://schemas.microsoft.com/office/word/2015/wordml/symex" xmlns:wpg="http://schemas.microsoft.com/office/word/2010/wordprocessingGroup" xmlns:wpi="http://schemas.microsoft.com/office/word/2010/wordprocessingInk" xmlns:wne="http://schemas.microsoft.com/office/word/2006/wordml" xmlns:wps="http://schemas.microsoft.com/office/word/2010/wordprocessingShape" mc:Ignorable="w14 w15 w16se w16cid w16 w16cex w16sdtdh w16sdtfl w16du wp14">
   <w:body>
-    <w:p>
-      <w:pPr>
-        <w:jc w:val="center"/>
-        <w:rPr>
-          <w:rFonts w:ascii="Noto Sans" w:hAnsi="Noto Sans"/>
-          <w:sz w:val="300"/>
-          <w:szCs w:val="300"/>
-        </w:rPr>
-      </w:pPr>
-      <w:r>
-        <w:rPr>
-          <w:rFonts w:ascii="Noto Sans" w:hAnsi="Noto Sans"/>
+    <w:sdt>
+      <w:sdtPr>
+        <w:rPr>
+          <w:color w:val="156082" w:themeColor="accent1"/>
+        </w:rPr>
+        <w:id w:val="1263571189"/>
+        <w:docPartObj>
+          <w:docPartGallery w:val="Cover Pages"/>
+          <w:docPartUnique/>
+        </w:docPartObj>
+      </w:sdtPr>
+      <w:sdtEndPr>
+        <w:rPr>
+          <w:rFonts w:ascii="Noto Sans" w:eastAsiaTheme="minorHAnsi" w:hAnsi="Noto Sans" w:cs="Times New Roman (Body CS)"/>
           <w:b/>
-          <w:color w:val="FF0000"/>
-          <w:sz w:val="300"/>
-          <w:szCs w:val="300"/>
-        </w:rPr>
-        <w:t>SRT</w:t>
-      </w:r>
-    </w:p>
-    <w:p>
-      <w:pPr>
-        <w:jc w:val="center"/>
-        <w:rPr>
-          <w:rFonts w:ascii="Noto Sans" w:hAnsi="Noto Sans"/>
-          <w:b/>
+          <w:color w:val="auto"/>
+          <w:kern w:val="2"/>
           <w:sz w:val="80"/>
           <w:szCs w:val="80"/>
-        </w:rPr>
-      </w:pPr>
-      <w:r>
-        <w:rPr>
-          <w:rFonts w:ascii="Noto Sans" w:hAnsi="Noto Sans"/>
-          <w:b/>
-          <w:sz w:val="80"/>
-          <w:szCs w:val="80"/>
-        </w:rPr>
-        <w:t>Dining Car Menu</w:t>
-      </w:r>
-      <w:r>
-        <w:rPr>
-          <w:rFonts w:ascii="Noto Sans" w:hAnsi="Noto Sans"/>
-          <w:noProof/>
-        </w:rPr>
-        <w:drawing>
-          <wp:inline distT="0" distB="0" distL="0" distR="0" wp14:anchorId="787B626D" wp14:editId="6C10AB05">
-            <wp:extent cx="2152650" cy="2152650"/>
-            <wp:effectExtent l="0" t="0" r="0" b="0"/>
-            <wp:docPr id="2078267603" name="Grafický objekt 1"/>
-            <wp:cNvGraphicFramePr>
-              <a:graphicFrameLocks xmlns:a="http://schemas.openxmlformats.org/drawingml/2006/main" noChangeAspect="1"/>
-            </wp:cNvGraphicFramePr>
-            <a:graphic xmlns:a="http://schemas.openxmlformats.org/drawingml/2006/main">
-              <a:graphicData uri="http://schemas.openxmlformats.org/drawingml/2006/picture">
-                <pic:pic xmlns:pic="http://schemas.openxmlformats.org/drawingml/2006/picture">
-                  <pic:nvPicPr>
-                    <pic:cNvPr id="2078267603" name="Grafický objekt 2078267603"/>
-                    <pic:cNvPicPr/>
-                  </pic:nvPicPr>
-                  <pic:blipFill>
-                    <a:blip r:embed="rId6">
-                      <a:extLst>
-                        <a:ext uri="{96DAC541-7B7A-43D3-8B79-37D633B846F1}">
-                          <asvg:svgBlip xmlns:asvg="http://schemas.microsoft.com/office/drawing/2016/SVG/main" r:embed="rId7"/>
-                        </a:ext>
-                      </a:extLst>
-                    </a:blip>
-                    <a:stretch>
-                      <a:fillRect/>
-                    </a:stretch>
-                  </pic:blipFill>
-                  <pic:spPr>
-                    <a:xfrm>
-                      <a:off x="0" y="0"/>
-                      <a:ext cx="2152650" cy="2152650"/>
-                    </a:xfrm>
-                    <a:prstGeom prst="rect">
-                      <a:avLst/>
-                    </a:prstGeom>
-                  </pic:spPr>
-                </pic:pic>
-              </a:graphicData>
-            </a:graphic>
-          </wp:inline>
-        </w:drawing>
-      </w:r>
-    </w:p>
-    <w:p>
-      <w:pPr>
-        <w:jc w:val="center"/>
-        <w:rPr>
-          <w:rFonts w:ascii="Noto Sans" w:hAnsi="Noto Sans"/>
-          <w:b/>
-          <w:sz w:val="32"/>
-          <w:szCs w:val="32"/>
-        </w:rPr>
-      </w:pPr>
-      <w:r>
-        <w:rPr>
-          <w:rFonts w:ascii="Noto Sans" w:hAnsi="Noto Sans"/>
-          <w:b/>
-          <w:sz w:val="32"/>
-          <w:szCs w:val="32"/>
-        </w:rPr>
-        <w:t>Website</w:t>
-      </w:r>
-    </w:p>
-    <w:p>
-      <w:pPr>
-        <w:rPr>
-          <w:rFonts w:ascii="Noto Sans" w:hAnsi="Noto Sans"/>
-          <w:b/>
-          <w:sz w:val="80"/>
-          <w:szCs w:val="80"/>
-        </w:rPr>
-      </w:pPr>
-    </w:p>
+          <w:lang w:val="en-US" w:eastAsia="en-US"/>
+          <w14:ligatures w14:val="standardContextual"/>
+        </w:rPr>
+      </w:sdtEndPr>
+      <w:sdtContent>
+        <w:p>
+          <w:pPr>
+            <w:pStyle w:val="NoSpacing"/>
+            <w:spacing w:before="1540" w:after="240"/>
+            <w:jc w:val="center"/>
+            <w:rPr>
+              <w:color w:val="156082" w:themeColor="accent1"/>
+            </w:rPr>
+          </w:pPr>
+          <w:r>
+            <w:rPr>
+              <w:noProof/>
+              <w:color w:val="156082" w:themeColor="accent1"/>
+              <w14:ligatures w14:val="standardContextual"/>
+            </w:rPr>
+            <w:drawing>
+              <wp:inline distT="0" distB="0" distL="0" distR="0" wp14:anchorId="3335B6F8" wp14:editId="63AF5489">
+                <wp:extent cx="1607820" cy="1607820"/>
+                <wp:effectExtent l="0" t="0" r="0" b="0"/>
+                <wp:docPr id="1136343015" name="Graphic 2"/>
+                <wp:cNvGraphicFramePr>
+                  <a:graphicFrameLocks xmlns:a="http://schemas.openxmlformats.org/drawingml/2006/main" noChangeAspect="1"/>
+                </wp:cNvGraphicFramePr>
+                <a:graphic xmlns:a="http://schemas.openxmlformats.org/drawingml/2006/main">
+                  <a:graphicData uri="http://schemas.openxmlformats.org/drawingml/2006/picture">
+                    <pic:pic xmlns:pic="http://schemas.openxmlformats.org/drawingml/2006/picture">
+                      <pic:nvPicPr>
+                        <pic:cNvPr id="1136343015" name="Graphic 1136343015"/>
+                        <pic:cNvPicPr/>
+                      </pic:nvPicPr>
+                      <pic:blipFill>
+                        <a:blip r:embed="rId7">
+                          <a:extLst>
+                            <a:ext uri="{96DAC541-7B7A-43D3-8B79-37D633B846F1}">
+                              <asvg:svgBlip xmlns:asvg="http://schemas.microsoft.com/office/drawing/2016/SVG/main" r:embed="rId8"/>
+                            </a:ext>
+                          </a:extLst>
+                        </a:blip>
+                        <a:stretch>
+                          <a:fillRect/>
+                        </a:stretch>
+                      </pic:blipFill>
+                      <pic:spPr>
+                        <a:xfrm>
+                          <a:off x="0" y="0"/>
+                          <a:ext cx="1607820" cy="1607820"/>
+                        </a:xfrm>
+                        <a:prstGeom prst="rect">
+                          <a:avLst/>
+                        </a:prstGeom>
+                      </pic:spPr>
+                    </pic:pic>
+                  </a:graphicData>
+                </a:graphic>
+              </wp:inline>
+            </w:drawing>
+          </w:r>
+        </w:p>
+        <w:p>
+          <w:pPr>
+            <w:pStyle w:val="NoSpacing"/>
+            <w:pBdr>
+              <w:top w:val="single" w:sz="6" w:space="6" w:color="156082" w:themeColor="accent1"/>
+              <w:bottom w:val="single" w:sz="6" w:space="6" w:color="156082" w:themeColor="accent1"/>
+            </w:pBdr>
+            <w:spacing w:after="240"/>
+            <w:jc w:val="center"/>
+            <w:rPr>
+              <w:rFonts w:asciiTheme="majorHAnsi" w:eastAsiaTheme="majorEastAsia" w:hAnsiTheme="majorHAnsi" w:cstheme="majorBidi"/>
+              <w:caps/>
+              <w:color w:val="156082" w:themeColor="accent1"/>
+              <w:sz w:val="80"/>
+              <w:szCs w:val="80"/>
+            </w:rPr>
+          </w:pPr>
+          <w:sdt>
+            <w:sdtPr>
+              <w:rPr>
+                <w:rFonts w:asciiTheme="majorHAnsi" w:eastAsiaTheme="majorEastAsia" w:hAnsiTheme="majorHAnsi" w:cstheme="majorBidi"/>
+                <w:caps/>
+                <w:color w:val="156082" w:themeColor="accent1"/>
+                <w:sz w:val="72"/>
+                <w:szCs w:val="72"/>
+              </w:rPr>
+              <w:alias w:val="Title"/>
+              <w:tag w:val=""/>
+              <w:id w:val="1735040861"/>
+              <w:placeholder>
+                <w:docPart w:val="7356BB83ADEB4F67AAB9E830F47512E5"/>
+              </w:placeholder>
+              <w:dataBinding w:prefixMappings="xmlns:ns0='http://purl.org/dc/elements/1.1/' xmlns:ns1='http://schemas.openxmlformats.org/package/2006/metadata/core-properties' " w:xpath="/ns1:coreProperties[1]/ns0:title[1]" w:storeItemID="{6C3C8BC8-F283-45AE-878A-BAB7291924A1}"/>
+              <w:text/>
+            </w:sdtPr>
+            <w:sdtEndPr>
+              <w:rPr>
+                <w:sz w:val="80"/>
+                <w:szCs w:val="80"/>
+              </w:rPr>
+            </w:sdtEndPr>
+            <w:sdtContent>
+              <w:r>
+                <w:rPr>
+                  <w:rFonts w:asciiTheme="majorHAnsi" w:eastAsiaTheme="majorEastAsia" w:hAnsiTheme="majorHAnsi" w:cstheme="majorBidi"/>
+                  <w:caps/>
+                  <w:color w:val="156082" w:themeColor="accent1"/>
+                  <w:sz w:val="72"/>
+                  <w:szCs w:val="72"/>
+                </w:rPr>
+                <w:t>Dining car menu</w:t>
+              </w:r>
+            </w:sdtContent>
+          </w:sdt>
+          <w:r>
+            <w:rPr>
+              <w:noProof/>
+              <w:color w:val="156082" w:themeColor="accent1"/>
+            </w:rPr>
+            <mc:AlternateContent>
+              <mc:Choice Requires="wps">
+                <w:drawing>
+                  <wp:anchor distT="0" distB="0" distL="114300" distR="114300" simplePos="0" relativeHeight="251659264" behindDoc="0" locked="0" layoutInCell="1" allowOverlap="1" wp14:anchorId="241DC974" wp14:editId="25C6342B">
+                    <wp:simplePos x="0" y="0"/>
+                    <wp:positionH relativeFrom="margin">
+                      <wp:align>center</wp:align>
+                    </wp:positionH>
+                    <mc:AlternateContent>
+                      <mc:Choice Requires="wp14">
+                        <wp:positionV relativeFrom="page">
+                          <wp14:pctPosVOffset>85000</wp14:pctPosVOffset>
+                        </wp:positionV>
+                      </mc:Choice>
+                      <mc:Fallback>
+                        <wp:positionV relativeFrom="page">
+                          <wp:posOffset>8549640</wp:posOffset>
+                        </wp:positionV>
+                      </mc:Fallback>
+                    </mc:AlternateContent>
+                    <wp:extent cx="6553200" cy="557784"/>
+                    <wp:effectExtent l="0" t="0" r="0" b="12700"/>
+                    <wp:wrapNone/>
+                    <wp:docPr id="142" name="Text Box 146"/>
+                    <wp:cNvGraphicFramePr/>
+                    <a:graphic xmlns:a="http://schemas.openxmlformats.org/drawingml/2006/main">
+                      <a:graphicData uri="http://schemas.microsoft.com/office/word/2010/wordprocessingShape">
+                        <wps:wsp>
+                          <wps:cNvSpPr txBox="1"/>
+                          <wps:spPr>
+                            <a:xfrm>
+                              <a:off x="0" y="0"/>
+                              <a:ext cx="6553200" cy="557784"/>
+                            </a:xfrm>
+                            <a:prstGeom prst="rect">
+                              <a:avLst/>
+                            </a:prstGeom>
+                            <a:noFill/>
+                            <a:ln w="6350">
+                              <a:noFill/>
+                            </a:ln>
+                            <a:effectLst/>
+                          </wps:spPr>
+                          <wps:style>
+                            <a:lnRef idx="0">
+                              <a:schemeClr val="accent1"/>
+                            </a:lnRef>
+                            <a:fillRef idx="0">
+                              <a:schemeClr val="accent1"/>
+                            </a:fillRef>
+                            <a:effectRef idx="0">
+                              <a:schemeClr val="accent1"/>
+                            </a:effectRef>
+                            <a:fontRef idx="minor">
+                              <a:schemeClr val="dk1"/>
+                            </a:fontRef>
+                          </wps:style>
+                          <wps:txbx>
+                            <w:txbxContent>
+                              <w:sdt>
+                                <w:sdtPr>
+                                  <w:rPr>
+                                    <w:caps/>
+                                    <w:color w:val="156082" w:themeColor="accent1"/>
+                                    <w:sz w:val="28"/>
+                                    <w:szCs w:val="28"/>
+                                  </w:rPr>
+                                  <w:alias w:val="Date"/>
+                                  <w:tag w:val=""/>
+                                  <w:id w:val="197127006"/>
+                                  <w:dataBinding w:prefixMappings="xmlns:ns0='http://schemas.microsoft.com/office/2006/coverPageProps' " w:xpath="/ns0:CoverPageProperties[1]/ns0:PublishDate[1]" w:storeItemID="{55AF091B-3C7A-41E3-B477-F2FDAA23CFDA}"/>
+                                  <w:date w:fullDate="2026-06-19T00:00:00Z">
+                                    <w:dateFormat w:val="dd MMMM yyyy"/>
+                                    <w:lid w:val="en-GB"/>
+                                    <w:storeMappedDataAs w:val="dateTime"/>
+                                    <w:calendar w:val="gregorian"/>
+                                  </w:date>
+                                </w:sdtPr>
+                                <w:sdtContent>
+                                  <w:p>
+                                    <w:pPr>
+                                      <w:pStyle w:val="NoSpacing"/>
+                                      <w:spacing w:after="40"/>
+                                      <w:jc w:val="center"/>
+                                      <w:rPr>
+                                        <w:caps/>
+                                        <w:color w:val="156082" w:themeColor="accent1"/>
+                                        <w:sz w:val="28"/>
+                                        <w:szCs w:val="28"/>
+                                      </w:rPr>
+                                    </w:pPr>
+                                    <w:r>
+                                      <w:rPr>
+                                        <w:caps/>
+                                        <w:color w:val="156082" w:themeColor="accent1"/>
+                                        <w:sz w:val="28"/>
+                                        <w:szCs w:val="28"/>
+                                        <w:lang w:val="en-GB"/>
+                                      </w:rPr>
+                                      <w:t>19 June 2026</w:t>
+                                    </w:r>
+                                  </w:p>
+                                </w:sdtContent>
+                              </w:sdt>
+                              <w:p>
+                                <w:pPr>
+                                  <w:pStyle w:val="NoSpacing"/>
+                                  <w:jc w:val="center"/>
+                                  <w:rPr>
+                                    <w:color w:val="156082" w:themeColor="accent1"/>
+                                  </w:rPr>
+                                </w:pPr>
+                                <w:sdt>
+                                  <w:sdtPr>
+                                    <w:rPr>
+                                      <w:caps/>
+                                      <w:color w:val="156082" w:themeColor="accent1"/>
+                                    </w:rPr>
+                                    <w:alias w:val="Company"/>
+                                    <w:tag w:val=""/>
+                                    <w:id w:val="1390145197"/>
+                                    <w:dataBinding w:prefixMappings="xmlns:ns0='http://schemas.openxmlformats.org/officeDocument/2006/extended-properties' " w:xpath="/ns0:Properties[1]/ns0:Company[1]" w:storeItemID="{6668398D-A668-4E3E-A5EB-62B293D839F1}"/>
+                                    <w:text/>
+                                  </w:sdtPr>
+                                  <w:sdtContent>
+                                    <w:r>
+                                      <w:rPr>
+                                        <w:caps/>
+                                        <w:color w:val="156082" w:themeColor="accent1"/>
+                                      </w:rPr>
+                                      <w:t>NEther Republic transport</w:t>
+                                    </w:r>
+                                  </w:sdtContent>
+                                </w:sdt>
+                              </w:p>
+                              <w:p>
+                                <w:pPr>
+                                  <w:pStyle w:val="NoSpacing"/>
+                                  <w:rPr>
+                                    <w:color w:val="156082" w:themeColor="accent1"/>
+                                  </w:rPr>
+                                </w:pPr>
+                              </w:p>
+                            </w:txbxContent>
+                          </wps:txbx>
+                          <wps:bodyPr rot="0" spcFirstLastPara="0" vertOverflow="overflow" horzOverflow="overflow" vert="horz" wrap="square" lIns="0" tIns="0" rIns="0" bIns="0" numCol="1" spcCol="0" rtlCol="0" fromWordArt="0" anchor="b" anchorCtr="0" forceAA="0" compatLnSpc="1">
+                            <a:prstTxWarp prst="textNoShape">
+                              <a:avLst/>
+                            </a:prstTxWarp>
+                            <a:spAutoFit/>
+                          </wps:bodyPr>
+                        </wps:wsp>
+                      </a:graphicData>
+                    </a:graphic>
+                    <wp14:sizeRelH relativeFrom="margin">
+                      <wp14:pctWidth>100000</wp14:pctWidth>
+                    </wp14:sizeRelH>
+                    <wp14:sizeRelV relativeFrom="margin">
+                      <wp14:pctHeight>0</wp14:pctHeight>
+                    </wp14:sizeRelV>
+                  </wp:anchor>
+                </w:drawing>
+              </mc:Choice>
+              <mc:Fallback>
+                <w:pict>
+                  <v:shapetype w14:anchorId="241DC974" id="_x0000_t202" coordsize="21600,21600" o:spt="202" path="m,l,21600r21600,l21600,xe">
+                    <v:stroke joinstyle="miter"/>
+                    <v:path gradientshapeok="t" o:connecttype="rect"/>
+                  </v:shapetype>
+                  <v:shape id="Text Box 146" o:spid="_x0000_s1026" type="#_x0000_t202" style="position:absolute;left:0;text-align:left;margin-left:0;margin-top:0;width:516pt;height:43.9pt;z-index:251659264;visibility:visible;mso-wrap-style:square;mso-width-percent:1000;mso-height-percent:0;mso-top-percent:850;mso-wrap-distance-left:9pt;mso-wrap-distance-top:0;mso-wrap-distance-right:9pt;mso-wrap-distance-bottom:0;mso-position-horizontal:center;mso-position-horizontal-relative:margin;mso-position-vertical-relative:page;mso-width-percent:1000;mso-height-percent:0;mso-top-percent:850;mso-width-relative:margin;mso-height-relative:margin;v-text-anchor:bottom" o:gfxdata="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" filled="f" stroked="f" strokeweight=".5pt">
+                    <v:textbox style="mso-fit-shape-to-text:t" inset="0,0,0,0">
+                      <w:txbxContent>
+                        <w:sdt>
+                          <w:sdtPr>
+                            <w:rPr>
+                              <w:caps/>
+                              <w:color w:val="156082" w:themeColor="accent1"/>
+                              <w:sz w:val="28"/>
+                              <w:szCs w:val="28"/>
+                            </w:rPr>
+                            <w:alias w:val="Date"/>
+                            <w:tag w:val=""/>
+                            <w:id w:val="197127006"/>
+                            <w:dataBinding w:prefixMappings="xmlns:ns0='http://schemas.microsoft.com/office/2006/coverPageProps' " w:xpath="/ns0:CoverPageProperties[1]/ns0:PublishDate[1]" w:storeItemID="{55AF091B-3C7A-41E3-B477-F2FDAA23CFDA}"/>
+                            <w:date w:fullDate="2026-06-19T00:00:00Z">
+                              <w:dateFormat w:val="dd MMMM yyyy"/>
+                              <w:lid w:val="en-GB"/>
+                              <w:storeMappedDataAs w:val="dateTime"/>
+                              <w:calendar w:val="gregorian"/>
+                            </w:date>
+                          </w:sdtPr>
+                          <w:sdtContent>
+                            <w:p>
+                              <w:pPr>
+                                <w:pStyle w:val="NoSpacing"/>
+                                <w:spacing w:after="40"/>
+                                <w:jc w:val="center"/>
+                                <w:rPr>
+                                  <w:caps/>
+                                  <w:color w:val="156082" w:themeColor="accent1"/>
+                                  <w:sz w:val="28"/>
+                                  <w:szCs w:val="28"/>
+                                </w:rPr>
+                              </w:pPr>
+                              <w:r>
+                                <w:rPr>
+                                  <w:caps/>
+                                  <w:color w:val="156082" w:themeColor="accent1"/>
+                                  <w:sz w:val="28"/>
+                                  <w:szCs w:val="28"/>
+                                  <w:lang w:val="en-GB"/>
+                                </w:rPr>
+                                <w:t>19 June 2026</w:t>
+                              </w:r>
+                            </w:p>
+                          </w:sdtContent>
+                        </w:sdt>
+                        <w:p>
+                          <w:pPr>
+                            <w:pStyle w:val="NoSpacing"/>
+                            <w:jc w:val="center"/>
+                            <w:rPr>
+                              <w:color w:val="156082" w:themeColor="accent1"/>
+                            </w:rPr>
+                          </w:pPr>
+                          <w:sdt>
+                            <w:sdtPr>
+                              <w:rPr>
+                                <w:caps/>
+                                <w:color w:val="156082" w:themeColor="accent1"/>
+                              </w:rPr>
+                              <w:alias w:val="Company"/>
+                              <w:tag w:val=""/>
+                              <w:id w:val="1390145197"/>
+                              <w:dataBinding w:prefixMappings="xmlns:ns0='http://schemas.openxmlformats.org/officeDocument/2006/extended-properties' " w:xpath="/ns0:Properties[1]/ns0:Company[1]" w:storeItemID="{6668398D-A668-4E3E-A5EB-62B293D839F1}"/>
+                              <w:text/>
+                            </w:sdtPr>
+                            <w:sdtContent>
+                              <w:r>
+                                <w:rPr>
+                                  <w:caps/>
+                                  <w:color w:val="156082" w:themeColor="accent1"/>
+                                </w:rPr>
+                                <w:t>NEther Republic transport</w:t>
+                              </w:r>
+                            </w:sdtContent>
+                          </w:sdt>
+                        </w:p>
+                        <w:p>
+                          <w:pPr>
+                            <w:pStyle w:val="NoSpacing"/>
+                            <w:rPr>
+                              <w:color w:val="156082" w:themeColor="accent1"/>
+                            </w:rPr>
+                          </w:pPr>
+                        </w:p>
+                      </w:txbxContent>
+                    </v:textbox>
+                    <w10:wrap anchorx="margin" anchory="page"/>
+                  </v:shape>
+                </w:pict>
+              </mc:Fallback>
+            </mc:AlternateContent>
+          </w:r>
+        </w:p>
+        <w:p>
+          <w:pPr>
+            <w:rPr>
+              <w:rFonts w:ascii="Noto Sans" w:hAnsi="Noto Sans"/>
+              <w:b/>
+              <w:sz w:val="80"/>
+              <w:szCs w:val="80"/>
+            </w:rPr>
+          </w:pPr>
+          <w:r>
+            <w:rPr>
+              <w:rFonts w:ascii="Noto Sans" w:hAnsi="Noto Sans"/>
+              <w:b/>
+              <w:sz w:val="80"/>
+              <w:szCs w:val="80"/>
+            </w:rPr>
+            <w:br w:type="page"/>
+          </w:r>
+        </w:p>
+      </w:sdtContent>
+    </w:sdt>
     <w:p>
       <w:pPr>
         <w:rPr>
@@ -127,8 +437,11 @@
         <w:sectPr>
           <w:pgSz w:w="12240" w:h="15840"/>
           <w:pgMar w:top="1134" w:right="1134" w:bottom="1134" w:left="1134" w:header="0" w:footer="0" w:gutter="0"/>
+          <w:pgNumType w:start="0"/>
           <w:cols w:space="708"/>
           <w:formProt w:val="0"/>
+          <w:titlePg/>
+          <w:docGrid w:linePitch="326"/>
         </w:sectPr>
       </w:pPr>
     </w:p>
@@ -494,7 +807,6 @@
           <w:sz w:val="40"/>
           <w:szCs w:val="40"/>
         </w:rPr>
-        <w:lastRenderedPageBreak/>
         <w:t>Soft drinks</w:t>
       </w:r>
     </w:p>
@@ -721,7 +1033,6 @@
           <w:sz w:val="40"/>
           <w:szCs w:val="40"/>
         </w:rPr>
-        <w:lastRenderedPageBreak/>
         <w:t>Cakes</w:t>
       </w:r>
     </w:p>
@@ -1656,15 +1967,15 @@
     <w:lsdException w:name="Unresolved Mention" w:semiHidden="1" w:unhideWhenUsed="1"/>
     <w:lsdException w:name="Smart Link" w:semiHidden="1" w:unhideWhenUsed="1"/>
   </w:latentStyles>
-  <w:style w:type="paragraph" w:default="1" w:styleId="Normln">
+  <w:style w:type="paragraph" w:default="1" w:styleId="Normal">
     <w:name w:val="Normal"/>
     <w:qFormat/>
   </w:style>
-  <w:style w:type="paragraph" w:styleId="Nadpis1">
+  <w:style w:type="paragraph" w:styleId="Heading1">
     <w:name w:val="heading 1"/>
-    <w:basedOn w:val="Normln"/>
-    <w:next w:val="Normln"/>
-    <w:link w:val="Nadpis1Char"/>
+    <w:basedOn w:val="Normal"/>
+    <w:next w:val="Normal"/>
+    <w:link w:val="Heading1Char"/>
     <w:uiPriority w:val="9"/>
     <w:qFormat/>
     <w:rsid w:val="00233D7B"/>
@@ -1681,11 +1992,11 @@
       <w:szCs w:val="40"/>
     </w:rPr>
   </w:style>
-  <w:style w:type="paragraph" w:styleId="Nadpis2">
+  <w:style w:type="paragraph" w:styleId="Heading2">
     <w:name w:val="heading 2"/>
-    <w:basedOn w:val="Normln"/>
-    <w:next w:val="Normln"/>
-    <w:link w:val="Nadpis2Char"/>
+    <w:basedOn w:val="Normal"/>
+    <w:next w:val="Normal"/>
+    <w:link w:val="Heading2Char"/>
     <w:uiPriority w:val="9"/>
     <w:semiHidden/>
     <w:unhideWhenUsed/>
@@ -1704,11 +2015,11 @@
       <w:szCs w:val="32"/>
     </w:rPr>
   </w:style>
-  <w:style w:type="paragraph" w:styleId="Nadpis3">
+  <w:style w:type="paragraph" w:styleId="Heading3">
     <w:name w:val="heading 3"/>
-    <w:basedOn w:val="Normln"/>
-    <w:next w:val="Normln"/>
-    <w:link w:val="Nadpis3Char"/>
+    <w:basedOn w:val="Normal"/>
+    <w:next w:val="Normal"/>
+    <w:link w:val="Heading3Char"/>
     <w:uiPriority w:val="9"/>
     <w:semiHidden/>
     <w:unhideWhenUsed/>
@@ -1727,11 +2038,11 @@
       <w:szCs w:val="28"/>
     </w:rPr>
   </w:style>
-  <w:style w:type="paragraph" w:styleId="Nadpis4">
+  <w:style w:type="paragraph" w:styleId="Heading4">
     <w:name w:val="heading 4"/>
-    <w:basedOn w:val="Normln"/>
-    <w:next w:val="Normln"/>
-    <w:link w:val="Nadpis4Char"/>
+    <w:basedOn w:val="Normal"/>
+    <w:next w:val="Normal"/>
+    <w:link w:val="Heading4Char"/>
     <w:uiPriority w:val="9"/>
     <w:semiHidden/>
     <w:unhideWhenUsed/>
@@ -1750,11 +2061,11 @@
       <w:color w:val="0F4761" w:themeColor="accent1" w:themeShade="BF"/>
     </w:rPr>
   </w:style>
-  <w:style w:type="paragraph" w:styleId="Nadpis5">
+  <w:style w:type="paragraph" w:styleId="Heading5">
     <w:name w:val="heading 5"/>
-    <w:basedOn w:val="Normln"/>
-    <w:next w:val="Normln"/>
-    <w:link w:val="Nadpis5Char"/>
+    <w:basedOn w:val="Normal"/>
+    <w:next w:val="Normal"/>
+    <w:link w:val="Heading5Char"/>
     <w:uiPriority w:val="9"/>
     <w:semiHidden/>
     <w:unhideWhenUsed/>
@@ -1771,11 +2082,11 @@
       <w:color w:val="0F4761" w:themeColor="accent1" w:themeShade="BF"/>
     </w:rPr>
   </w:style>
-  <w:style w:type="paragraph" w:styleId="Nadpis6">
+  <w:style w:type="paragraph" w:styleId="Heading6">
     <w:name w:val="heading 6"/>
-    <w:basedOn w:val="Normln"/>
-    <w:next w:val="Normln"/>
-    <w:link w:val="Nadpis6Char"/>
+    <w:basedOn w:val="Normal"/>
+    <w:next w:val="Normal"/>
+    <w:link w:val="Heading6Char"/>
     <w:uiPriority w:val="9"/>
     <w:semiHidden/>
     <w:unhideWhenUsed/>
@@ -1794,11 +2105,11 @@
       <w:color w:val="595959" w:themeColor="text1" w:themeTint="A6"/>
     </w:rPr>
   </w:style>
-  <w:style w:type="paragraph" w:styleId="Nadpis7">
+  <w:style w:type="paragraph" w:styleId="Heading7">
     <w:name w:val="heading 7"/>
-    <w:basedOn w:val="Normln"/>
-    <w:next w:val="Normln"/>
-    <w:link w:val="Nadpis7Char"/>
+    <w:basedOn w:val="Normal"/>
+    <w:next w:val="Normal"/>
+    <w:link w:val="Heading7Char"/>
     <w:uiPriority w:val="9"/>
     <w:semiHidden/>
     <w:unhideWhenUsed/>
@@ -1815,11 +2126,11 @@
       <w:color w:val="595959" w:themeColor="text1" w:themeTint="A6"/>
     </w:rPr>
   </w:style>
-  <w:style w:type="paragraph" w:styleId="Nadpis8">
+  <w:style w:type="paragraph" w:styleId="Heading8">
     <w:name w:val="heading 8"/>
-    <w:basedOn w:val="Normln"/>
-    <w:next w:val="Normln"/>
-    <w:link w:val="Nadpis8Char"/>
+    <w:basedOn w:val="Normal"/>
+    <w:next w:val="Normal"/>
+    <w:link w:val="Heading8Char"/>
     <w:uiPriority w:val="9"/>
     <w:semiHidden/>
     <w:unhideWhenUsed/>
@@ -1837,11 +2148,11 @@
       <w:color w:val="272727" w:themeColor="text1" w:themeTint="D8"/>
     </w:rPr>
   </w:style>
-  <w:style w:type="paragraph" w:styleId="Nadpis9">
+  <w:style w:type="paragraph" w:styleId="Heading9">
     <w:name w:val="heading 9"/>
-    <w:basedOn w:val="Normln"/>
-    <w:next w:val="Normln"/>
-    <w:link w:val="Nadpis9Char"/>
+    <w:basedOn w:val="Normal"/>
+    <w:next w:val="Normal"/>
+    <w:link w:val="Heading9Char"/>
     <w:uiPriority w:val="9"/>
     <w:semiHidden/>
     <w:unhideWhenUsed/>
@@ -1857,13 +2168,13 @@
       <w:color w:val="272727" w:themeColor="text1" w:themeTint="D8"/>
     </w:rPr>
   </w:style>
-  <w:style w:type="character" w:default="1" w:styleId="Standardnpsmoodstavce">
+  <w:style w:type="character" w:default="1" w:styleId="DefaultParagraphFont">
     <w:name w:val="Default Paragraph Font"/>
     <w:uiPriority w:val="1"/>
     <w:semiHidden/>
     <w:unhideWhenUsed/>
   </w:style>
-  <w:style w:type="table" w:default="1" w:styleId="Normlntabulka">
+  <w:style w:type="table" w:default="1" w:styleId="TableNormal">
     <w:name w:val="Normal Table"/>
     <w:uiPriority w:val="99"/>
     <w:semiHidden/>
@@ -1878,16 +2189,16 @@
       </w:tblCellMar>
     </w:tblPr>
   </w:style>
-  <w:style w:type="numbering" w:default="1" w:styleId="Bezseznamu">
+  <w:style w:type="numbering" w:default="1" w:styleId="NoList">
     <w:name w:val="No List"/>
     <w:uiPriority w:val="99"/>
     <w:semiHidden/>
     <w:unhideWhenUsed/>
   </w:style>
-  <w:style w:type="character" w:customStyle="1" w:styleId="Nadpis1Char">
-    <w:name w:val="Nadpis 1 Char"/>
-    <w:basedOn w:val="Standardnpsmoodstavce"/>
-    <w:link w:val="Nadpis1"/>
+  <w:style w:type="character" w:customStyle="1" w:styleId="Heading1Char">
+    <w:name w:val="Heading 1 Char"/>
+    <w:basedOn w:val="DefaultParagraphFont"/>
+    <w:link w:val="Heading1"/>
     <w:uiPriority w:val="9"/>
     <w:qFormat/>
     <w:rsid w:val="00233D7B"/>
@@ -1898,10 +2209,10 @@
       <w:szCs w:val="40"/>
     </w:rPr>
   </w:style>
-  <w:style w:type="character" w:customStyle="1" w:styleId="Nadpis2Char">
-    <w:name w:val="Nadpis 2 Char"/>
-    <w:basedOn w:val="Standardnpsmoodstavce"/>
-    <w:link w:val="Nadpis2"/>
+  <w:style w:type="character" w:customStyle="1" w:styleId="Heading2Char">
+    <w:name w:val="Heading 2 Char"/>
+    <w:basedOn w:val="DefaultParagraphFont"/>
+    <w:link w:val="Heading2"/>
     <w:uiPriority w:val="9"/>
     <w:semiHidden/>
     <w:qFormat/>
@@ -1913,10 +2224,10 @@
       <w:szCs w:val="32"/>
     </w:rPr>
   </w:style>
-  <w:style w:type="character" w:customStyle="1" w:styleId="Nadpis3Char">
-    <w:name w:val="Nadpis 3 Char"/>
-    <w:basedOn w:val="Standardnpsmoodstavce"/>
-    <w:link w:val="Nadpis3"/>
+  <w:style w:type="character" w:customStyle="1" w:styleId="Heading3Char">
+    <w:name w:val="Heading 3 Char"/>
+    <w:basedOn w:val="DefaultParagraphFont"/>
+    <w:link w:val="Heading3"/>
     <w:uiPriority w:val="9"/>
     <w:semiHidden/>
     <w:qFormat/>
@@ -1928,10 +2239,10 @@
       <w:szCs w:val="28"/>
     </w:rPr>
   </w:style>
-  <w:style w:type="character" w:customStyle="1" w:styleId="Nadpis4Char">
-    <w:name w:val="Nadpis 4 Char"/>
-    <w:basedOn w:val="Standardnpsmoodstavce"/>
-    <w:link w:val="Nadpis4"/>
+  <w:style w:type="character" w:customStyle="1" w:styleId="Heading4Char">
+    <w:name w:val="Heading 4 Char"/>
+    <w:basedOn w:val="DefaultParagraphFont"/>
+    <w:link w:val="Heading4"/>
     <w:uiPriority w:val="9"/>
     <w:semiHidden/>
     <w:qFormat/>
@@ -1943,10 +2254,10 @@
       <w:color w:val="0F4761" w:themeColor="accent1" w:themeShade="BF"/>
     </w:rPr>
   </w:style>
-  <w:style w:type="character" w:customStyle="1" w:styleId="Nadpis5Char">
-    <w:name w:val="Nadpis 5 Char"/>
-    <w:basedOn w:val="Standardnpsmoodstavce"/>
-    <w:link w:val="Nadpis5"/>
+  <w:style w:type="character" w:customStyle="1" w:styleId="Heading5Char">
+    <w:name w:val="Heading 5 Char"/>
+    <w:basedOn w:val="DefaultParagraphFont"/>
+    <w:link w:val="Heading5"/>
     <w:uiPriority w:val="9"/>
     <w:semiHidden/>
     <w:qFormat/>
@@ -1956,10 +2267,10 @@
       <w:color w:val="0F4761" w:themeColor="accent1" w:themeShade="BF"/>
     </w:rPr>
   </w:style>
-  <w:style w:type="character" w:customStyle="1" w:styleId="Nadpis6Char">
-    <w:name w:val="Nadpis 6 Char"/>
-    <w:basedOn w:val="Standardnpsmoodstavce"/>
-    <w:link w:val="Nadpis6"/>
+  <w:style w:type="character" w:customStyle="1" w:styleId="Heading6Char">
+    <w:name w:val="Heading 6 Char"/>
+    <w:basedOn w:val="DefaultParagraphFont"/>
+    <w:link w:val="Heading6"/>
     <w:uiPriority w:val="9"/>
     <w:semiHidden/>
     <w:qFormat/>
@@ -1971,10 +2282,10 @@
       <w:color w:val="595959" w:themeColor="text1" w:themeTint="A6"/>
     </w:rPr>
   </w:style>
-  <w:style w:type="character" w:customStyle="1" w:styleId="Nadpis7Char">
-    <w:name w:val="Nadpis 7 Char"/>
-    <w:basedOn w:val="Standardnpsmoodstavce"/>
-    <w:link w:val="Nadpis7"/>
+  <w:style w:type="character" w:customStyle="1" w:styleId="Heading7Char">
+    <w:name w:val="Heading 7 Char"/>
+    <w:basedOn w:val="DefaultParagraphFont"/>
+    <w:link w:val="Heading7"/>
     <w:uiPriority w:val="9"/>
     <w:semiHidden/>
     <w:qFormat/>
@@ -1984,10 +2295,10 @@
       <w:color w:val="595959" w:themeColor="text1" w:themeTint="A6"/>
     </w:rPr>
   </w:style>
-  <w:style w:type="character" w:customStyle="1" w:styleId="Nadpis8Char">
-    <w:name w:val="Nadpis 8 Char"/>
-    <w:basedOn w:val="Standardnpsmoodstavce"/>
-    <w:link w:val="Nadpis8"/>
+  <w:style w:type="character" w:customStyle="1" w:styleId="Heading8Char">
+    <w:name w:val="Heading 8 Char"/>
+    <w:basedOn w:val="DefaultParagraphFont"/>
+    <w:link w:val="Heading8"/>
     <w:uiPriority w:val="9"/>
     <w:semiHidden/>
     <w:qFormat/>
@@ -1999,10 +2310,10 @@
       <w:color w:val="272727" w:themeColor="text1" w:themeTint="D8"/>
     </w:rPr>
   </w:style>
-  <w:style w:type="character" w:customStyle="1" w:styleId="Nadpis9Char">
-    <w:name w:val="Nadpis 9 Char"/>
-    <w:basedOn w:val="Standardnpsmoodstavce"/>
-    <w:link w:val="Nadpis9"/>
+  <w:style w:type="character" w:customStyle="1" w:styleId="Heading9Char">
+    <w:name w:val="Heading 9 Char"/>
+    <w:basedOn w:val="DefaultParagraphFont"/>
+    <w:link w:val="Heading9"/>
     <w:uiPriority w:val="9"/>
     <w:semiHidden/>
     <w:qFormat/>
@@ -2012,10 +2323,10 @@
       <w:color w:val="272727" w:themeColor="text1" w:themeTint="D8"/>
     </w:rPr>
   </w:style>
-  <w:style w:type="character" w:customStyle="1" w:styleId="NzevChar">
-    <w:name w:val="Název Char"/>
-    <w:basedOn w:val="Standardnpsmoodstavce"/>
-    <w:link w:val="Nzev"/>
+  <w:style w:type="character" w:customStyle="1" w:styleId="TitleChar">
+    <w:name w:val="Title Char"/>
+    <w:basedOn w:val="DefaultParagraphFont"/>
+    <w:link w:val="Title"/>
     <w:uiPriority w:val="10"/>
     <w:qFormat/>
     <w:rsid w:val="00233D7B"/>
@@ -2027,10 +2338,10 @@
       <w:szCs w:val="56"/>
     </w:rPr>
   </w:style>
-  <w:style w:type="character" w:customStyle="1" w:styleId="PodnadpisChar">
-    <w:name w:val="Podnadpis Char"/>
-    <w:basedOn w:val="Standardnpsmoodstavce"/>
-    <w:link w:val="Podnadpis"/>
+  <w:style w:type="character" w:customStyle="1" w:styleId="SubtitleChar">
+    <w:name w:val="Subtitle Char"/>
+    <w:basedOn w:val="DefaultParagraphFont"/>
+    <w:link w:val="Subtitle"/>
     <w:uiPriority w:val="11"/>
     <w:qFormat/>
     <w:rsid w:val="00233D7B"/>
@@ -2042,10 +2353,10 @@
       <w:szCs w:val="28"/>
     </w:rPr>
   </w:style>
-  <w:style w:type="character" w:customStyle="1" w:styleId="CittChar">
-    <w:name w:val="Citát Char"/>
-    <w:basedOn w:val="Standardnpsmoodstavce"/>
-    <w:link w:val="Citt"/>
+  <w:style w:type="character" w:customStyle="1" w:styleId="QuoteChar">
+    <w:name w:val="Quote Char"/>
+    <w:basedOn w:val="DefaultParagraphFont"/>
+    <w:link w:val="Quote"/>
     <w:uiPriority w:val="29"/>
     <w:qFormat/>
     <w:rsid w:val="00233D7B"/>
@@ -2055,9 +2366,9 @@
       <w:color w:val="404040" w:themeColor="text1" w:themeTint="BF"/>
     </w:rPr>
   </w:style>
-  <w:style w:type="character" w:styleId="Zdraznnintenzivn">
+  <w:style w:type="character" w:styleId="IntenseEmphasis">
     <w:name w:val="Intense Emphasis"/>
-    <w:basedOn w:val="Standardnpsmoodstavce"/>
+    <w:basedOn w:val="DefaultParagraphFont"/>
     <w:uiPriority w:val="21"/>
     <w:qFormat/>
     <w:rsid w:val="00233D7B"/>
@@ -2067,10 +2378,10 @@
       <w:color w:val="0F4761" w:themeColor="accent1" w:themeShade="BF"/>
     </w:rPr>
   </w:style>
-  <w:style w:type="character" w:customStyle="1" w:styleId="VrazncittChar">
-    <w:name w:val="Výrazný citát Char"/>
-    <w:basedOn w:val="Standardnpsmoodstavce"/>
-    <w:link w:val="Vrazncitt"/>
+  <w:style w:type="character" w:customStyle="1" w:styleId="IntenseQuoteChar">
+    <w:name w:val="Intense Quote Char"/>
+    <w:basedOn w:val="DefaultParagraphFont"/>
+    <w:link w:val="IntenseQuote"/>
     <w:uiPriority w:val="30"/>
     <w:qFormat/>
     <w:rsid w:val="00233D7B"/>
@@ -2080,9 +2391,9 @@
       <w:color w:val="0F4761" w:themeColor="accent1" w:themeShade="BF"/>
     </w:rPr>
   </w:style>
-  <w:style w:type="character" w:styleId="Odkazintenzivn">
+  <w:style w:type="character" w:styleId="IntenseReference">
     <w:name w:val="Intense Reference"/>
-    <w:basedOn w:val="Standardnpsmoodstavce"/>
+    <w:basedOn w:val="DefaultParagraphFont"/>
     <w:uiPriority w:val="32"/>
     <w:qFormat/>
     <w:rsid w:val="00233D7B"/>
@@ -2094,9 +2405,9 @@
       <w:spacing w:val="5"/>
     </w:rPr>
   </w:style>
-  <w:style w:type="character" w:styleId="Hypertextovodkaz">
+  <w:style w:type="character" w:styleId="Hyperlink">
     <w:name w:val="Hyperlink"/>
-    <w:basedOn w:val="Standardnpsmoodstavce"/>
+    <w:basedOn w:val="DefaultParagraphFont"/>
     <w:uiPriority w:val="99"/>
     <w:unhideWhenUsed/>
     <w:rsid w:val="00D87CC4"/>
@@ -2116,8 +2427,8 @@
   </w:style>
   <w:style w:type="paragraph" w:customStyle="1" w:styleId="Nadpis">
     <w:name w:val="Nadpis"/>
-    <w:basedOn w:val="Normln"/>
-    <w:next w:val="Zkladntext"/>
+    <w:basedOn w:val="Normal"/>
+    <w:next w:val="BodyText"/>
     <w:qFormat/>
     <w:pPr>
       <w:keepNext/>
@@ -2129,23 +2440,23 @@
       <w:szCs w:val="28"/>
     </w:rPr>
   </w:style>
-  <w:style w:type="paragraph" w:styleId="Zkladntext">
+  <w:style w:type="paragraph" w:styleId="BodyText">
     <w:name w:val="Body Text"/>
-    <w:basedOn w:val="Normln"/>
+    <w:basedOn w:val="Normal"/>
     <w:pPr>
       <w:spacing w:after="140" w:line="276" w:lineRule="auto"/>
     </w:pPr>
   </w:style>
-  <w:style w:type="paragraph" w:styleId="Seznam">
+  <w:style w:type="paragraph" w:styleId="List">
     <w:name w:val="List"/>
-    <w:basedOn w:val="Zkladntext"/>
+    <w:basedOn w:val="BodyText"/>
     <w:rPr>
       <w:rFonts w:cs="Arial"/>
     </w:rPr>
   </w:style>
-  <w:style w:type="paragraph" w:styleId="Titulek">
+  <w:style w:type="paragraph" w:styleId="Caption">
     <w:name w:val="caption"/>
-    <w:basedOn w:val="Normln"/>
+    <w:basedOn w:val="Normal"/>
     <w:qFormat/>
     <w:pPr>
       <w:suppressLineNumbers/>
@@ -2159,7 +2470,7 @@
   </w:style>
   <w:style w:type="paragraph" w:customStyle="1" w:styleId="Rejstk">
     <w:name w:val="Rejstřík"/>
-    <w:basedOn w:val="Normln"/>
+    <w:basedOn w:val="Normal"/>
     <w:qFormat/>
     <w:pPr>
       <w:suppressLineNumbers/>
@@ -2170,8 +2481,8 @@
   </w:style>
   <w:style w:type="paragraph" w:customStyle="1" w:styleId="Nadpisuser">
     <w:name w:val="Nadpis (user)"/>
-    <w:basedOn w:val="Normln"/>
-    <w:next w:val="Zkladntext"/>
+    <w:basedOn w:val="Normal"/>
+    <w:next w:val="BodyText"/>
     <w:qFormat/>
     <w:pPr>
       <w:keepNext/>
@@ -2185,7 +2496,7 @@
   </w:style>
   <w:style w:type="paragraph" w:customStyle="1" w:styleId="Rejstkuser">
     <w:name w:val="Rejstřík (user)"/>
-    <w:basedOn w:val="Normln"/>
+    <w:basedOn w:val="Normal"/>
     <w:qFormat/>
     <w:pPr>
       <w:suppressLineNumbers/>
@@ -2194,11 +2505,11 @@
       <w:rFonts w:cs="Arial"/>
     </w:rPr>
   </w:style>
-  <w:style w:type="paragraph" w:styleId="Nzev">
+  <w:style w:type="paragraph" w:styleId="Title">
     <w:name w:val="Title"/>
-    <w:basedOn w:val="Normln"/>
-    <w:next w:val="Normln"/>
-    <w:link w:val="NzevChar"/>
+    <w:basedOn w:val="Normal"/>
+    <w:next w:val="Normal"/>
+    <w:link w:val="TitleChar"/>
     <w:uiPriority w:val="10"/>
     <w:qFormat/>
     <w:rsid w:val="00233D7B"/>
@@ -2213,11 +2524,11 @@
       <w:szCs w:val="56"/>
     </w:rPr>
   </w:style>
-  <w:style w:type="paragraph" w:styleId="Podnadpis">
+  <w:style w:type="paragraph" w:styleId="Subtitle">
     <w:name w:val="Subtitle"/>
-    <w:basedOn w:val="Normln"/>
-    <w:next w:val="Normln"/>
-    <w:link w:val="PodnadpisChar"/>
+    <w:basedOn w:val="Normal"/>
+    <w:next w:val="Normal"/>
+    <w:link w:val="SubtitleChar"/>
     <w:uiPriority w:val="11"/>
     <w:qFormat/>
     <w:rsid w:val="00233D7B"/>
@@ -2232,11 +2543,11 @@
       <w:szCs w:val="28"/>
     </w:rPr>
   </w:style>
-  <w:style w:type="paragraph" w:styleId="Citt">
+  <w:style w:type="paragraph" w:styleId="Quote">
     <w:name w:val="Quote"/>
-    <w:basedOn w:val="Normln"/>
-    <w:next w:val="Normln"/>
-    <w:link w:val="CittChar"/>
+    <w:basedOn w:val="Normal"/>
+    <w:next w:val="Normal"/>
+    <w:link w:val="QuoteChar"/>
     <w:uiPriority w:val="29"/>
     <w:qFormat/>
     <w:rsid w:val="00233D7B"/>
@@ -2250,9 +2561,9 @@
       <w:color w:val="404040" w:themeColor="text1" w:themeTint="BF"/>
     </w:rPr>
   </w:style>
-  <w:style w:type="paragraph" w:styleId="Odstavecseseznamem">
+  <w:style w:type="paragraph" w:styleId="ListParagraph">
     <w:name w:val="List Paragraph"/>
-    <w:basedOn w:val="Normln"/>
+    <w:basedOn w:val="Normal"/>
     <w:uiPriority w:val="34"/>
     <w:qFormat/>
     <w:rsid w:val="00233D7B"/>
@@ -2261,11 +2572,11 @@
       <w:contextualSpacing/>
     </w:pPr>
   </w:style>
-  <w:style w:type="paragraph" w:styleId="Vrazncitt">
+  <w:style w:type="paragraph" w:styleId="IntenseQuote">
     <w:name w:val="Intense Quote"/>
-    <w:basedOn w:val="Normln"/>
-    <w:next w:val="Normln"/>
-    <w:link w:val="VrazncittChar"/>
+    <w:basedOn w:val="Normal"/>
+    <w:next w:val="Normal"/>
+    <w:link w:val="IntenseQuoteChar"/>
     <w:uiPriority w:val="30"/>
     <w:qFormat/>
     <w:rsid w:val="00233D7B"/>
@@ -2284,14 +2595,14 @@
       <w:color w:val="0F4761" w:themeColor="accent1" w:themeShade="BF"/>
     </w:rPr>
   </w:style>
-  <w:style w:type="paragraph" w:styleId="Hlavikarejstku">
+  <w:style w:type="paragraph" w:styleId="IndexHeading">
     <w:name w:val="index heading"/>
     <w:basedOn w:val="Nadpisuser"/>
   </w:style>
-  <w:style w:type="paragraph" w:styleId="Nadpisobsahu">
+  <w:style w:type="paragraph" w:styleId="TOCHeading">
     <w:name w:val="TOC Heading"/>
-    <w:basedOn w:val="Nadpis1"/>
-    <w:next w:val="Normln"/>
+    <w:basedOn w:val="Heading1"/>
+    <w:next w:val="Normal"/>
     <w:uiPriority w:val="39"/>
     <w:unhideWhenUsed/>
     <w:qFormat/>
@@ -2315,7 +2626,663 @@
     <w:unhideWhenUsed/>
     <w:qFormat/>
   </w:style>
+  <w:style w:type="paragraph" w:styleId="NoSpacing">
+    <w:name w:val="No Spacing"/>
+    <w:link w:val="NoSpacingChar"/>
+    <w:uiPriority w:val="1"/>
+    <w:qFormat/>
+    <w:rsid w:val="00CB0F6A"/>
+    <w:pPr>
+      <w:suppressAutoHyphens w:val="0"/>
+    </w:pPr>
+    <w:rPr>
+      <w:rFonts w:asciiTheme="minorHAnsi" w:eastAsiaTheme="minorEastAsia" w:hAnsiTheme="minorHAnsi" w:cstheme="minorBidi"/>
+      <w:kern w:val="0"/>
+      <w:sz w:val="22"/>
+      <w:szCs w:val="22"/>
+      <w:lang w:val="cs-CZ" w:eastAsia="cs-CZ"/>
+      <w14:ligatures w14:val="none"/>
+    </w:rPr>
+  </w:style>
+  <w:style w:type="character" w:customStyle="1" w:styleId="NoSpacingChar">
+    <w:name w:val="No Spacing Char"/>
+    <w:basedOn w:val="DefaultParagraphFont"/>
+    <w:link w:val="NoSpacing"/>
+    <w:uiPriority w:val="1"/>
+    <w:rsid w:val="00CB0F6A"/>
+    <w:rPr>
+      <w:rFonts w:asciiTheme="minorHAnsi" w:eastAsiaTheme="minorEastAsia" w:hAnsiTheme="minorHAnsi" w:cstheme="minorBidi"/>
+      <w:kern w:val="0"/>
+      <w:sz w:val="22"/>
+      <w:szCs w:val="22"/>
+      <w:lang w:val="cs-CZ" w:eastAsia="cs-CZ"/>
+      <w14:ligatures w14:val="none"/>
+    </w:rPr>
+  </w:style>
 </w:styles>
+</file>
+
+<file path=word/glossary/document.xml><?xml version="1.0" encoding="utf-8"?>
+<w:glossaryDocument xmlns:wpc="http://schemas.microsoft.com/office/word/2010/wordprocessingCanvas" xmlns:cx="http://schemas.microsoft.com/office/drawing/2014/chartex" xmlns:cx1="http://schemas.microsoft.com/office/drawing/2015/9/8/chartex" xmlns:cx2="http://schemas.microsoft.com/office/drawing/2015/10/21/chartex" xmlns:cx3="http://schemas.microsoft.com/office/drawing/2016/5/9/chartex" xmlns:cx4="http://schemas.microsoft.com/office/drawing/2016/5/10/chartex" xmlns:cx5="http://schemas.microsoft.com/office/drawing/2016/5/11/chartex" xmlns:cx6="http://schemas.microsoft.com/office/drawing/2016/5/12/chartex" xmlns:cx7="http://schemas.microsoft.com/office/drawing/2016/5/13/chartex" xmlns:cx8="http://schemas.microsoft.com/office/drawing/2016/5/14/chartex" xmlns:mc="http://schemas.openxmlformats.org/markup-compatibility/2006" xmlns:aink="http://schemas.microsoft.com/office/drawing/2016/ink" xmlns:am3d="http://schemas.microsoft.com/office/drawing/2017/model3d" xmlns:o="urn:schemas-microsoft-com:office:office" xmlns:oel="http://schemas.microsoft.com/office/2019/extlst" xmlns:r="http://schemas.openxmlformats.org/officeDocument/2006/relationships" xmlns:m="http://schemas.openxmlformats.org/officeDocument/2006/math" xmlns:v="urn:schemas-microsoft-com:vml" xmlns:wp14="http://schemas.microsoft.com/office/word/2010/wordprocessingDrawing" xmlns:wp="http://schemas.openxmlformats.org/drawingml/2006/wordprocessingDrawing" xmlns:w10="urn:schemas-microsoft-com:office:word" xmlns:w="http://schemas.openxmlformats.org/wordprocessingml/2006/main" xmlns:w14="http://schemas.microsoft.com/office/word/2010/wordml" xmlns:w15="http://schemas.microsoft.com/office/word/2012/wordml" xmlns:w16cex="http://schemas.microsoft.com/office/word/2018/wordml/cex" xmlns:w16cid="http://schemas.microsoft.com/office/word/2016/wordml/cid" xmlns:w16="http://schemas.microsoft.com/office/word/2018/wordml" xmlns:w16du="http://schemas.microsoft.com/office/word/2023/wordml/word16du" xmlns:w16sdtdh="http://schemas.microsoft.com/office/word/2020/wordml/sdtdatahash" xmlns:w16sdtfl="http://schemas.microsoft.com/office/word/2024/wordml/sdtformatlock" xmlns:w16se="http://schemas.microsoft.com/office/word/2015/wordml/symex" xmlns:wpg="http://schemas.microsoft.com/office/word/2010/wordprocessingGroup" xmlns:wpi="http://schemas.microsoft.com/office/word/2010/wordprocessingInk" xmlns:wne="http://schemas.microsoft.com/office/word/2006/wordml" xmlns:wps="http://schemas.microsoft.com/office/word/2010/wordprocessingShape" mc:Ignorable="w14 w15 w16se w16cid w16 w16cex w16sdtdh w16sdtfl w16du wp14">
+  <w:docParts>
+    <w:docPart>
+      <w:docPartPr>
+        <w:name w:val="7356BB83ADEB4F67AAB9E830F47512E5"/>
+        <w:category>
+          <w:name w:val="General"/>
+          <w:gallery w:val="placeholder"/>
+        </w:category>
+        <w:types>
+          <w:type w:val="bbPlcHdr"/>
+        </w:types>
+        <w:behaviors>
+          <w:behavior w:val="content"/>
+        </w:behaviors>
+        <w:guid w:val="{9C933F1B-BE2D-4F13-BB4A-4CE043175630}"/>
+      </w:docPartPr>
+      <w:docPartBody>
+        <w:p>
+          <w:pPr>
+            <w:pStyle w:val="7356BB83ADEB4F67AAB9E830F47512E5"/>
+          </w:pPr>
+          <w:r>
+            <w:rPr>
+              <w:rFonts w:asciiTheme="majorHAnsi" w:eastAsiaTheme="majorEastAsia" w:hAnsiTheme="majorHAnsi" w:cstheme="majorBidi"/>
+              <w:caps/>
+              <w:color w:val="4472C4" w:themeColor="accent1"/>
+              <w:sz w:val="80"/>
+              <w:szCs w:val="80"/>
+              <w:lang w:val="en-GB"/>
+            </w:rPr>
+            <w:t>[Document title]</w:t>
+          </w:r>
+        </w:p>
+      </w:docPartBody>
+    </w:docPart>
+  </w:docParts>
+</w:glossaryDocument>
+</file>
+
+<file path=word/glossary/fontTable.xml><?xml version="1.0" encoding="utf-8"?>
+<w:fonts xmlns:mc="http://schemas.openxmlformats.org/markup-compatibility/2006" xmlns:r="http://schemas.openxmlformats.org/officeDocument/2006/relationships" xmlns:w="http://schemas.openxmlformats.org/wordprocessingml/2006/main" xmlns:w14="http://schemas.microsoft.com/office/word/2010/wordml" xmlns:w15="http://schemas.microsoft.com/office/word/2012/wordml" xmlns:w16cex="http://schemas.microsoft.com/office/word/2018/wordml/cex" xmlns:w16cid="http://schemas.microsoft.com/office/word/2016/wordml/cid" xmlns:w16="http://schemas.microsoft.com/office/word/2018/wordml" xmlns:w16du="http://schemas.microsoft.com/office/word/2023/wordml/word16du" xmlns:w16sdtdh="http://schemas.microsoft.com/office/word/2020/wordml/sdtdatahash" xmlns:w16sdtfl="http://schemas.microsoft.com/office/word/2024/wordml/sdtformatlock" xmlns:w16se="http://schemas.microsoft.com/office/word/2015/wordml/symex" mc:Ignorable="w14 w15 w16se w16cid w16 w16cex w16sdtdh w16sdtfl w16du">
+  <w:font w:name="Wingdings 2">
+    <w:panose1 w:val="05020102010507070707"/>
+    <w:charset w:val="02"/>
+    <w:family w:val="roman"/>
+    <w:pitch w:val="variable"/>
+    <w:sig w:usb0="00000000" w:usb1="10000000" w:usb2="00000000" w:usb3="00000000" w:csb0="80000000" w:csb1="00000000"/>
+  </w:font>
+  <w:font w:name="Times New Roman">
+    <w:panose1 w:val="02020603050405020304"/>
+    <w:charset w:val="EE"/>
+    <w:family w:val="roman"/>
+    <w:pitch w:val="variable"/>
+    <w:sig w:usb0="E0002EFF" w:usb1="C000785B" w:usb2="00000009" w:usb3="00000000" w:csb0="000001FF" w:csb1="00000000"/>
+  </w:font>
+  <w:font w:name="OpenSymbol">
+    <w:altName w:val="Arial Unicode MS"/>
+    <w:charset w:val="00"/>
+    <w:family w:val="auto"/>
+    <w:pitch w:val="variable"/>
+    <w:sig w:usb0="800000AF" w:usb1="1001ECEA" w:usb2="00000000" w:usb3="00000000" w:csb0="80000001" w:csb1="00000000"/>
+  </w:font>
+  <w:font w:name="Symbol">
+    <w:panose1 w:val="05050102010706020507"/>
+    <w:charset w:val="02"/>
+    <w:family w:val="roman"/>
+    <w:pitch w:val="variable"/>
+    <w:sig w:usb0="00000000" w:usb1="10000000" w:usb2="00000000" w:usb3="00000000" w:csb0="80000000" w:csb1="00000000"/>
+  </w:font>
+  <w:font w:name="Arial">
+    <w:panose1 w:val="020B0604020202020204"/>
+    <w:charset w:val="EE"/>
+    <w:family w:val="swiss"/>
+    <w:pitch w:val="variable"/>
+    <w:sig w:usb0="E0002EFF" w:usb1="C000785B" w:usb2="00000009" w:usb3="00000000" w:csb0="000001FF" w:csb1="00000000"/>
+  </w:font>
+  <w:font w:name="Aptos">
+    <w:charset w:val="00"/>
+    <w:family w:val="swiss"/>
+    <w:pitch w:val="variable"/>
+    <w:sig w:usb0="20000287" w:usb1="00000003" w:usb2="00000000" w:usb3="00000000" w:csb0="0000019F" w:csb1="00000000"/>
+  </w:font>
+  <w:font w:name="Times New Roman (Body CS)">
+    <w:altName w:val="Times New Roman"/>
+    <w:panose1 w:val="00000000000000000000"/>
+    <w:charset w:val="00"/>
+    <w:family w:val="roman"/>
+    <w:notTrueType/>
+    <w:pitch w:val="default"/>
+  </w:font>
+  <w:font w:name="Aptos Display">
+    <w:charset w:val="00"/>
+    <w:family w:val="swiss"/>
+    <w:pitch w:val="variable"/>
+    <w:sig w:usb0="20000287" w:usb1="00000003" w:usb2="00000000" w:usb3="00000000" w:csb0="0000019F" w:csb1="00000000"/>
+  </w:font>
+  <w:font w:name="Liberation Sans">
+    <w:altName w:val="Arial"/>
+    <w:charset w:val="EE"/>
+    <w:family w:val="swiss"/>
+    <w:pitch w:val="variable"/>
+    <w:sig w:usb0="E0000AFF" w:usb1="500078FF" w:usb2="00000021" w:usb3="00000000" w:csb0="000001BF" w:csb1="00000000"/>
+  </w:font>
+  <w:font w:name="Microsoft YaHei">
+    <w:panose1 w:val="020B0503020204020204"/>
+    <w:charset w:val="86"/>
+    <w:family w:val="swiss"/>
+    <w:pitch w:val="variable"/>
+    <w:sig w:usb0="80000287" w:usb1="2ACF3C50" w:usb2="00000016" w:usb3="00000000" w:csb0="0004001F" w:csb1="00000000"/>
+  </w:font>
+  <w:font w:name="Noto Sans">
+    <w:charset w:val="00"/>
+    <w:family w:val="swiss"/>
+    <w:pitch w:val="variable"/>
+    <w:sig w:usb0="E00082FF" w:usb1="400078FF" w:usb2="00000021" w:usb3="00000000" w:csb0="0000019F" w:csb1="00000000"/>
+  </w:font>
+  <w:font w:name="Calibri">
+    <w:panose1 w:val="020F0502020204030204"/>
+    <w:charset w:val="EE"/>
+    <w:family w:val="swiss"/>
+    <w:pitch w:val="variable"/>
+    <w:sig w:usb0="E4002EFF" w:usb1="C000247B" w:usb2="00000009" w:usb3="00000000" w:csb0="000001FF" w:csb1="00000000"/>
+  </w:font>
+  <w:font w:name="Calibri Light">
+    <w:panose1 w:val="020F0302020204030204"/>
+    <w:charset w:val="EE"/>
+    <w:family w:val="swiss"/>
+    <w:pitch w:val="variable"/>
+    <w:sig w:usb0="E4002EFF" w:usb1="C000247B" w:usb2="00000009" w:usb3="00000000" w:csb0="000001FF" w:csb1="00000000"/>
+  </w:font>
+</w:fonts>
+</file>
+
+<file path=word/glossary/settings.xml><?xml version="1.0" encoding="utf-8"?>
+<w:settings xmlns:mc="http://schemas.openxmlformats.org/markup-compatibility/2006" xmlns:o="urn:schemas-microsoft-com:office:office" xmlns:r="http://schemas.openxmlformats.org/officeDocument/2006/relationships" xmlns:m="http://schemas.openxmlformats.org/officeDocument/2006/math" xmlns:v="urn:schemas-microsoft-com:vml" xmlns:w10="urn:schemas-microsoft-com:office:word" xmlns:w="http://schemas.openxmlformats.org/wordprocessingml/2006/main" xmlns:w14="http://schemas.microsoft.com/office/word/2010/wordml" xmlns:w15="http://schemas.microsoft.com/office/word/2012/wordml" xmlns:w16cex="http://schemas.microsoft.com/office/word/2018/wordml/cex" xmlns:w16cid="http://schemas.microsoft.com/office/word/2016/wordml/cid" xmlns:w16="http://schemas.microsoft.com/office/word/2018/wordml" xmlns:w16du="http://schemas.microsoft.com/office/word/2023/wordml/word16du" xmlns:w16sdtdh="http://schemas.microsoft.com/office/word/2020/wordml/sdtdatahash" xmlns:w16sdtfl="http://schemas.microsoft.com/office/word/2024/wordml/sdtformatlock" xmlns:w16se="http://schemas.microsoft.com/office/word/2015/wordml/symex" xmlns:sl="http://schemas.openxmlformats.org/schemaLibrary/2006/main" mc:Ignorable="w14 w15 w16se w16cid w16 w16cex w16sdtdh w16sdtfl w16du">
+  <w:view w:val="normal"/>
+  <w:revisionView w:inkAnnotations="0"/>
+  <w:defaultTabStop w:val="708"/>
+  <w:hyphenationZone w:val="425"/>
+  <w:characterSpacingControl w:val="doNotCompress"/>
+  <w:compat>
+    <w:useFELayout/>
+    <w:compatSetting w:name="compatibilityMode" w:uri="http://schemas.microsoft.com/office/word" w:val="15"/>
+    <w:compatSetting w:name="overrideTableStyleFontSizeAndJustification" w:uri="http://schemas.microsoft.com/office/word" w:val="1"/>
+    <w:compatSetting w:name="enableOpenTypeFeatures" w:uri="http://schemas.microsoft.com/office/word" w:val="1"/>
+    <w:compatSetting w:name="doNotFlipMirrorIndents" w:uri="http://schemas.microsoft.com/office/word" w:val="1"/>
+    <w:compatSetting w:name="differentiateMultirowTableHeaders" w:uri="http://schemas.microsoft.com/office/word" w:val="1"/>
+    <w:compatSetting w:name="useWord2013TrackBottomHyphenation" w:uri="http://schemas.microsoft.com/office/word" w:val="0"/>
+  </w:compat>
+  <w:rsids>
+    <w:rsidRoot w:val="00663F92"/>
+    <w:rsid w:val="00663F92"/>
+    <w:rsid w:val="00C712F2"/>
+  </w:rsids>
+  <m:mathPr>
+    <m:mathFont m:val="Cambria Math"/>
+    <m:brkBin m:val="before"/>
+    <m:brkBinSub m:val="--"/>
+    <m:smallFrac m:val="0"/>
+    <m:dispDef/>
+    <m:lMargin m:val="0"/>
+    <m:rMargin m:val="0"/>
+    <m:defJc m:val="centerGroup"/>
+    <m:wrapIndent m:val="1440"/>
+    <m:intLim m:val="subSup"/>
+    <m:naryLim m:val="undOvr"/>
+  </m:mathPr>
+  <w:themeFontLang w:val="cs-CZ"/>
+  <w:clrSchemeMapping w:bg1="light1" w:t1="dark1" w:bg2="light2" w:t2="dark2" w:accent1="accent1" w:accent2="accent2" w:accent3="accent3" w:accent4="accent4" w:accent5="accent5" w:accent6="accent6" w:hyperlink="hyperlink" w:followedHyperlink="followedHyperlink"/>
+  <w:decimalSymbol w:val=","/>
+  <w:listSeparator w:val=";"/>
+  <w15:chartTrackingRefBased/>
+</w:settings>
+</file>
+
+<file path=word/glossary/styles.xml><?xml version="1.0" encoding="utf-8"?>
+<w:styles xmlns:mc="http://schemas.openxmlformats.org/markup-compatibility/2006" xmlns:r="http://schemas.openxmlformats.org/officeDocument/2006/relationships" xmlns:w="http://schemas.openxmlformats.org/wordprocessingml/2006/main" xmlns:w14="http://schemas.microsoft.com/office/word/2010/wordml" xmlns:w15="http://schemas.microsoft.com/office/word/2012/wordml" xmlns:w16cex="http://schemas.microsoft.com/office/word/2018/wordml/cex" xmlns:w16cid="http://schemas.microsoft.com/office/word/2016/wordml/cid" xmlns:w16="http://schemas.microsoft.com/office/word/2018/wordml" xmlns:w16du="http://schemas.microsoft.com/office/word/2023/wordml/word16du" xmlns:w16sdtdh="http://schemas.microsoft.com/office/word/2020/wordml/sdtdatahash" xmlns:w16sdtfl="http://schemas.microsoft.com/office/word/2024/wordml/sdtformatlock" xmlns:w16se="http://schemas.microsoft.com/office/word/2015/wordml/symex" mc:Ignorable="w14 w15 w16se w16cid w16 w16cex w16sdtdh w16sdtfl w16du">
+  <w:docDefaults>
+    <w:rPrDefault>
+      <w:rPr>
+        <w:rFonts w:asciiTheme="minorHAnsi" w:eastAsiaTheme="minorEastAsia" w:hAnsiTheme="minorHAnsi" w:cstheme="minorBidi"/>
+        <w:kern w:val="2"/>
+        <w:sz w:val="24"/>
+        <w:szCs w:val="24"/>
+        <w:lang w:val="cs-CZ" w:eastAsia="cs-CZ" w:bidi="ar-SA"/>
+        <w14:ligatures w14:val="standardContextual"/>
+      </w:rPr>
+    </w:rPrDefault>
+    <w:pPrDefault>
+      <w:pPr>
+        <w:spacing w:after="160" w:line="278" w:lineRule="auto"/>
+      </w:pPr>
+    </w:pPrDefault>
+  </w:docDefaults>
+  <w:latentStyles w:defLockedState="0" w:defUIPriority="99" w:defSemiHidden="0" w:defUnhideWhenUsed="0" w:defQFormat="0" w:count="376">
+    <w:lsdException w:name="Normal" w:uiPriority="0" w:qFormat="1"/>
+    <w:lsdException w:name="heading 1" w:uiPriority="9" w:qFormat="1"/>
+    <w:lsdException w:name="heading 2" w:semiHidden="1" w:uiPriority="9" w:unhideWhenUsed="1" w:qFormat="1"/>
+    <w:lsdException w:name="heading 3" w:semiHidden="1" w:uiPriority="9" w:unhideWhenUsed="1" w:qFormat="1"/>
+    <w:lsdException w:name="heading 4" w:semiHidden="1" w:uiPriority="9" w:unhideWhenUsed="1" w:qFormat="1"/>
+    <w:lsdException w:name="heading 5" w:semiHidden="1" w:uiPriority="9" w:unhideWhenUsed="1" w:qFormat="1"/>
+    <w:lsdException w:name="heading 6" w:semiHidden="1" w:uiPriority="9" w:unhideWhenUsed="1" w:qFormat="1"/>
+    <w:lsdException w:name="heading 7" w:semiHidden="1" w:uiPriority="9" w:unhideWhenUsed="1" w:qFormat="1"/>
+    <w:lsdException w:name="heading 8" w:semiHidden="1" w:uiPriority="9" w:unhideWhenUsed="1" w:qFormat="1"/>
+    <w:lsdException w:name="heading 9" w:semiHidden="1" w:uiPriority="9" w:unhideWhenUsed="1" w:qFormat="1"/>
+    <w:lsdException w:name="index 1" w:semiHidden="1" w:unhideWhenUsed="1"/>
+    <w:lsdException w:name="index 2" w:semiHidden="1" w:unhideWhenUsed="1"/>
+    <w:lsdException w:name="index 3" w:semiHidden="1" w:unhideWhenUsed="1"/>
+    <w:lsdException w:name="index 4" w:semiHidden="1" w:unhideWhenUsed="1"/>
+    <w:lsdException w:name="index 5" w:semiHidden="1" w:unhideWhenUsed="1"/>
+    <w:lsdException w:name="index 6" w:semiHidden="1" w:unhideWhenUsed="1"/>
+    <w:lsdException w:name="index 7" w:semiHidden="1" w:unhideWhenUsed="1"/>
+    <w:lsdException w:name="index 8" w:semiHidden="1" w:unhideWhenUsed="1"/>
+    <w:lsdException w:name="index 9" w:semiHidden="1" w:unhideWhenUsed="1"/>
+    <w:lsdException w:name="toc 1" w:semiHidden="1" w:uiPriority="39" w:unhideWhenUsed="1"/>
+    <w:lsdException w:name="toc 2" w:semiHidden="1" w:uiPriority="39" w:unhideWhenUsed="1"/>
+    <w:lsdException w:name="toc 3" w:semiHidden="1" w:uiPriority="39" w:unhideWhenUsed="1"/>
+    <w:lsdException w:name="toc 4" w:semiHidden="1" w:uiPriority="39" w:unhideWhenUsed="1"/>
+    <w:lsdException w:name="toc 5" w:semiHidden="1" w:uiPriority="39" w:unhideWhenUsed="1"/>
+    <w:lsdException w:name="toc 6" w:semiHidden="1" w:uiPriority="39" w:unhideWhenUsed="1"/>
+    <w:lsdException w:name="toc 7" w:semiHidden="1" w:uiPriority="39" w:unhideWhenUsed="1"/>
+    <w:lsdException w:name="toc 8" w:semiHidden="1" w:uiPriority="39" w:unhideWhenUsed="1"/>
+    <w:lsdException w:name="toc 9" w:semiHidden="1" w:uiPriority="39" w:unhideWhenUsed="1"/>
+    <w:lsdException w:name="Normal Indent" w:semiHidden="1" w:unhideWhenUsed="1"/>
+    <w:lsdException w:name="footnote text" w:semiHidden="1" w:unhideWhenUsed="1"/>
+    <w:lsdException w:name="annotation text" w:semiHidden="1" w:unhideWhenUsed="1"/>
+    <w:lsdException w:name="header" w:semiHidden="1" w:unhideWhenUsed="1"/>
+    <w:lsdException w:name="footer" w:semiHidden="1" w:unhideWhenUsed="1"/>
+    <w:lsdException w:name="index heading" w:semiHidden="1" w:unhideWhenUsed="1"/>
+    <w:lsdException w:name="caption" w:semiHidden="1" w:uiPriority="35" w:unhideWhenUsed="1" w:qFormat="1"/>
+    <w:lsdException w:name="table of figures" w:semiHidden="1" w:unhideWhenUsed="1"/>
+    <w:lsdException w:name="envelope address" w:semiHidden="1" w:unhideWhenUsed="1"/>
+    <w:lsdException w:name="envelope return" w:semiHidden="1" w:unhideWhenUsed="1"/>
+    <w:lsdException w:name="footnote reference" w:semiHidden="1" w:unhideWhenUsed="1"/>
+    <w:lsdException w:name="annotation reference" w:semiHidden="1" w:unhideWhenUsed="1"/>
+    <w:lsdException w:name="line number" w:semiHidden="1" w:unhideWhenUsed="1"/>
+    <w:lsdException w:name="page number" w:semiHidden="1" w:unhideWhenUsed="1"/>
+    <w:lsdException w:name="endnote reference" w:semiHidden="1" w:unhideWhenUsed="1"/>
+    <w:lsdException w:name="endnote text" w:semiHidden="1" w:unhideWhenUsed="1"/>
+    <w:lsdException w:name="table of authorities" w:semiHidden="1" w:unhideWhenUsed="1"/>
+    <w:lsdException w:name="macro" w:semiHidden="1" w:unhideWhenUsed="1"/>
+    <w:lsdException w:name="toa heading" w:semiHidden="1" w:unhideWhenUsed="1"/>
+    <w:lsdException w:name="List" w:semiHidden="1" w:unhideWhenUsed="1"/>
+    <w:lsdException w:name="List Bullet" w:semiHidden="1" w:unhideWhenUsed="1"/>
+    <w:lsdException w:name="List Number" w:semiHidden="1" w:unhideWhenUsed="1"/>
+    <w:lsdException w:name="List 2" w:semiHidden="1" w:unhideWhenUsed="1"/>
+    <w:lsdException w:name="List 3" w:semiHidden="1" w:unhideWhenUsed="1"/>
+    <w:lsdException w:name="List 4" w:semiHidden="1" w:unhideWhenUsed="1"/>
+    <w:lsdException w:name="List 5" w:semiHidden="1" w:unhideWhenUsed="1"/>
+    <w:lsdException w:name="List Bullet 2" w:semiHidden="1" w:unhideWhenUsed="1"/>
+    <w:lsdException w:name="List Bullet 3" w:semiHidden="1" w:unhideWhenUsed="1"/>
+    <w:lsdException w:name="List Bullet 4" w:semiHidden="1" w:unhideWhenUsed="1"/>
+    <w:lsdException w:name="List Bullet 5" w:semiHidden="1" w:unhideWhenUsed="1"/>
+    <w:lsdException w:name="List Number 2" w:semiHidden="1" w:unhideWhenUsed="1"/>
+    <w:lsdException w:name="List Number 3" w:semiHidden="1" w:unhideWhenUsed="1"/>
+    <w:lsdException w:name="List Number 4" w:semiHidden="1" w:unhideWhenUsed="1"/>
+    <w:lsdException w:name="List Number 5" w:semiHidden="1" w:unhideWhenUsed="1"/>
+    <w:lsdException w:name="Title" w:uiPriority="10" w:qFormat="1"/>
+    <w:lsdException w:name="Closing" w:semiHidden="1" w:unhideWhenUsed="1"/>
+    <w:lsdException w:name="Signature" w:semiHidden="1" w:unhideWhenUsed="1"/>
+    <w:lsdException w:name="Default Paragraph Font" w:semiHidden="1" w:uiPriority="1" w:unhideWhenUsed="1"/>
+    <w:lsdException w:name="Body Text" w:semiHidden="1" w:unhideWhenUsed="1"/>
+    <w:lsdException w:name="Body Text Indent" w:semiHidden="1" w:unhideWhenUsed="1"/>
+    <w:lsdException w:name="List Continue" w:semiHidden="1" w:unhideWhenUsed="1"/>
+    <w:lsdException w:name="List Continue 2" w:semiHidden="1" w:unhideWhenUsed="1"/>
+    <w:lsdException w:name="List Continue 3" w:semiHidden="1" w:unhideWhenUsed="1"/>
+    <w:lsdException w:name="List Continue 4" w:semiHidden="1" w:unhideWhenUsed="1"/>
+    <w:lsdException w:name="List Continue 5" w:semiHidden="1" w:unhideWhenUsed="1"/>
+    <w:lsdException w:name="Message Header" w:semiHidden="1" w:unhideWhenUsed="1"/>
+    <w:lsdException w:name="Subtitle" w:uiPriority="11" w:qFormat="1"/>
+    <w:lsdException w:name="Salutation" w:semiHidden="1" w:unhideWhenUsed="1"/>
+    <w:lsdException w:name="Date" w:semiHidden="1" w:unhideWhenUsed="1"/>
+    <w:lsdException w:name="Body Text First Indent" w:semiHidden="1" w:unhideWhenUsed="1"/>
+    <w:lsdException w:name="Body Text First Indent 2" w:semiHidden="1" w:unhideWhenUsed="1"/>
+    <w:lsdException w:name="Note Heading" w:semiHidden="1" w:unhideWhenUsed="1"/>
+    <w:lsdException w:name="Body Text 2" w:semiHidden="1" w:unhideWhenUsed="1"/>
+    <w:lsdException w:name="Body Text 3" w:semiHidden="1" w:unhideWhenUsed="1"/>
+    <w:lsdException w:name="Body Text Indent 2" w:semiHidden="1" w:unhideWhenUsed="1"/>
+    <w:lsdException w:name="Body Text Indent 3" w:semiHidden="1" w:unhideWhenUsed="1"/>
+    <w:lsdException w:name="Block Text" w:semiHidden="1" w:unhideWhenUsed="1"/>
+    <w:lsdException w:name="Hyperlink" w:semiHidden="1" w:unhideWhenUsed="1"/>
+    <w:lsdException w:name="FollowedHyperlink" w:semiHidden="1" w:unhideWhenUsed="1"/>
+    <w:lsdException w:name="Strong" w:uiPriority="22" w:qFormat="1"/>
+    <w:lsdException w:name="Emphasis" w:uiPriority="20" w:qFormat="1"/>
+    <w:lsdException w:name="Document Map" w:semiHidden="1" w:unhideWhenUsed="1"/>
+    <w:lsdException w:name="Plain Text" w:semiHidden="1" w:unhideWhenUsed="1"/>
+    <w:lsdException w:name="E-mail Signature" w:semiHidden="1" w:unhideWhenUsed="1"/>
+    <w:lsdException w:name="HTML Top of Form" w:semiHidden="1" w:unhideWhenUsed="1"/>
+    <w:lsdException w:name="HTML Bottom of Form" w:semiHidden="1" w:unhideWhenUsed="1"/>
+    <w:lsdException w:name="Normal (Web)" w:semiHidden="1" w:unhideWhenUsed="1"/>
+    <w:lsdException w:name="HTML Acronym" w:semiHidden="1" w:unhideWhenUsed="1"/>
+    <w:lsdException w:name="HTML Address" w:semiHidden="1" w:unhideWhenUsed="1"/>
+    <w:lsdException w:name="HTML Cite" w:semiHidden="1" w:unhideWhenUsed="1"/>
+    <w:lsdException w:name="HTML Code" w:semiHidden="1" w:unhideWhenUsed="1"/>
+    <w:lsdException w:name="HTML Definition" w:semiHidden="1" w:unhideWhenUsed="1"/>
+    <w:lsdException w:name="HTML Keyboard" w:semiHidden="1" w:unhideWhenUsed="1"/>
+    <w:lsdException w:name="HTML Preformatted" w:semiHidden="1" w:unhideWhenUsed="1"/>
+    <w:lsdException w:name="HTML Sample" w:semiHidden="1" w:unhideWhenUsed="1"/>
+    <w:lsdException w:name="HTML Typewriter" w:semiHidden="1" w:unhideWhenUsed="1"/>
+    <w:lsdException w:name="HTML Variable" w:semiHidden="1" w:unhideWhenUsed="1"/>
+    <w:lsdException w:name="Normal Table" w:semiHidden="1" w:unhideWhenUsed="1"/>
+    <w:lsdException w:name="annotation subject" w:semiHidden="1" w:unhideWhenUsed="1"/>
+    <w:lsdException w:name="No List" w:semiHidden="1" w:unhideWhenUsed="1"/>
+    <w:lsdException w:name="Outline List 1" w:semiHidden="1" w:unhideWhenUsed="1"/>
+    <w:lsdException w:name="Outline List 2" w:semiHidden="1" w:unhideWhenUsed="1"/>
+    <w:lsdException w:name="Outline List 3" w:semiHidden="1" w:unhideWhenUsed="1"/>
+    <w:lsdException w:name="Table Simple 1" w:semiHidden="1" w:unhideWhenUsed="1"/>
+    <w:lsdException w:name="Table Simple 2" w:semiHidden="1" w:unhideWhenUsed="1"/>
+    <w:lsdException w:name="Table Simple 3" w:semiHidden="1" w:unhideWhenUsed="1"/>
+    <w:lsdException w:name="Table Classic 1" w:semiHidden="1" w:unhideWhenUsed="1"/>
+    <w:lsdException w:name="Table Classic 2" w:semiHidden="1" w:unhideWhenUsed="1"/>
+    <w:lsdException w:name="Table Classic 3" w:semiHidden="1" w:unhideWhenUsed="1"/>
+    <w:lsdException w:name="Table Classic 4" w:semiHidden="1" w:unhideWhenUsed="1"/>
+    <w:lsdException w:name="Table Colorful 1" w:semiHidden="1" w:unhideWhenUsed="1"/>
+    <w:lsdException w:name="Table Colorful 2" w:semiHidden="1" w:unhideWhenUsed="1"/>
+    <w:lsdException w:name="Table Colorful 3" w:semiHidden="1" w:unhideWhenUsed="1"/>
+    <w:lsdException w:name="Table Columns 1" w:semiHidden="1" w:unhideWhenUsed="1"/>
+    <w:lsdException w:name="Table Columns 2" w:semiHidden="1" w:unhideWhenUsed="1"/>
+    <w:lsdException w:name="Table Columns 3" w:semiHidden="1" w:unhideWhenUsed="1"/>
+    <w:lsdException w:name="Table Columns 4" w:semiHidden="1" w:unhideWhenUsed="1"/>
+    <w:lsdException w:name="Table Columns 5" w:semiHidden="1" w:unhideWhenUsed="1"/>
+    <w:lsdException w:name="Table Grid 1" w:semiHidden="1" w:unhideWhenUsed="1"/>
+    <w:lsdException w:name="Table Grid 2" w:semiHidden="1" w:unhideWhenUsed="1"/>
+    <w:lsdException w:name="Table Grid 3" w:semiHidden="1" w:unhideWhenUsed="1"/>
+    <w:lsdException w:name="Table Grid 4" w:semiHidden="1" w:unhideWhenUsed="1"/>
+    <w:lsdException w:name="Table Grid 5" w:semiHidden="1" w:unhideWhenUsed="1"/>
+    <w:lsdException w:name="Table Grid 6" w:semiHidden="1" w:unhideWhenUsed="1"/>
+    <w:lsdException w:name="Table Grid 7" w:semiHidden="1" w:unhideWhenUsed="1"/>
+    <w:lsdException w:name="Table Grid 8" w:semiHidden="1" w:unhideWhenUsed="1"/>
+    <w:lsdException w:name="Table List 1" w:semiHidden="1" w:unhideWhenUsed="1"/>
+    <w:lsdException w:name="Table List 2" w:semiHidden="1" w:unhideWhenUsed="1"/>
+    <w:lsdException w:name="Table List 3" w:semiHidden="1" w:unhideWhenUsed="1"/>
+    <w:lsdException w:name="Table List 4" w:semiHidden="1" w:unhideWhenUsed="1"/>
+    <w:lsdException w:name="Table List 5" w:semiHidden="1" w:unhideWhenUsed="1"/>
+    <w:lsdException w:name="Table List 6" w:semiHidden="1" w:unhideWhenUsed="1"/>
+    <w:lsdException w:name="Table List 7" w:semiHidden="1" w:unhideWhenUsed="1"/>
+    <w:lsdException w:name="Table List 8" w:semiHidden="1" w:unhideWhenUsed="1"/>
+    <w:lsdException w:name="Table 3D effects 1" w:semiHidden="1" w:unhideWhenUsed="1"/>
+    <w:lsdException w:name="Table 3D effects 2" w:semiHidden="1" w:unhideWhenUsed="1"/>
+    <w:lsdException w:name="Table 3D effects 3" w:semiHidden="1" w:unhideWhenUsed="1"/>
+    <w:lsdException w:name="Table Contemporary" w:semiHidden="1" w:unhideWhenUsed="1"/>
+    <w:lsdException w:name="Table Elegant" w:semiHidden="1" w:unhideWhenUsed="1"/>
+    <w:lsdException w:name="Table Professional" w:semiHidden="1" w:unhideWhenUsed="1"/>
+    <w:lsdException w:name="Table Subtle 1" w:semiHidden="1" w:unhideWhenUsed="1"/>
+    <w:lsdException w:name="Table Subtle 2" w:semiHidden="1" w:unhideWhenUsed="1"/>
+    <w:lsdException w:name="Table Web 1" w:semiHidden="1" w:unhideWhenUsed="1"/>
+    <w:lsdException w:name="Table Web 2" w:semiHidden="1" w:unhideWhenUsed="1"/>
+    <w:lsdException w:name="Table Web 3" w:semiHidden="1" w:unhideWhenUsed="1"/>
+    <w:lsdException w:name="Balloon Text" w:semiHidden="1" w:unhideWhenUsed="1"/>
+    <w:lsdException w:name="Table Grid" w:uiPriority="39"/>
+    <w:lsdException w:name="Table Theme" w:semiHidden="1" w:unhideWhenUsed="1"/>
+    <w:lsdException w:name="Placeholder Text" w:semiHidden="1"/>
+    <w:lsdException w:name="No Spacing" w:uiPriority="1" w:qFormat="1"/>
+    <w:lsdException w:name="Light Shading" w:uiPriority="60"/>
+    <w:lsdException w:name="Light List" w:uiPriority="61"/>
+    <w:lsdException w:name="Light Grid" w:uiPriority="62"/>
+    <w:lsdException w:name="Medium Shading 1" w:uiPriority="63"/>
+    <w:lsdException w:name="Medium Shading 2" w:uiPriority="64"/>
+    <w:lsdException w:name="Medium List 1" w:uiPriority="65"/>
+    <w:lsdException w:name="Medium List 2" w:uiPriority="66"/>
+    <w:lsdException w:name="Medium Grid 1" w:uiPriority="67"/>
+    <w:lsdException w:name="Medium Grid 2" w:uiPriority="68"/>
+    <w:lsdException w:name="Medium Grid 3" w:uiPriority="69"/>
+    <w:lsdException w:name="Dark List" w:uiPriority="70"/>
+    <w:lsdException w:name="Colorful Shading" w:uiPriority="71"/>
+    <w:lsdException w:name="Colorful List" w:uiPriority="72"/>
+    <w:lsdException w:name="Colorful Grid" w:uiPriority="73"/>
+    <w:lsdException w:name="Light Shading Accent 1" w:uiPriority="60"/>
+    <w:lsdException w:name="Light List Accent 1" w:uiPriority="61"/>
+    <w:lsdException w:name="Light Grid Accent 1" w:uiPriority="62"/>
+    <w:lsdException w:name="Medium Shading 1 Accent 1" w:uiPriority="63"/>
+    <w:lsdException w:name="Medium Shading 2 Accent 1" w:uiPriority="64"/>
+    <w:lsdException w:name="Medium List 1 Accent 1" w:uiPriority="65"/>
+    <w:lsdException w:name="Revision" w:semiHidden="1"/>
+    <w:lsdException w:name="List Paragraph" w:uiPriority="34" w:qFormat="1"/>
+    <w:lsdException w:name="Quote" w:uiPriority="29" w:qFormat="1"/>
+    <w:lsdException w:name="Intense Quote" w:uiPriority="30" w:qFormat="1"/>
+    <w:lsdException w:name="Medium List 2 Accent 1" w:uiPriority="66"/>
+    <w:lsdException w:name="Medium Grid 1 Accent 1" w:uiPriority="67"/>
+    <w:lsdException w:name="Medium Grid 2 Accent 1" w:uiPriority="68"/>
+    <w:lsdException w:name="Medium Grid 3 Accent 1" w:uiPriority="69"/>
+    <w:lsdException w:name="Dark List Accent 1" w:uiPriority="70"/>
+    <w:lsdException w:name="Colorful Shading Accent 1" w:uiPriority="71"/>
+    <w:lsdException w:name="Colorful List Accent 1" w:uiPriority="72"/>
+    <w:lsdException w:name="Colorful Grid Accent 1" w:uiPriority="73"/>
+    <w:lsdException w:name="Light Shading Accent 2" w:uiPriority="60"/>
+    <w:lsdException w:name="Light List Accent 2" w:uiPriority="61"/>
+    <w:lsdException w:name="Light Grid Accent 2" w:uiPriority="62"/>
+    <w:lsdException w:name="Medium Shading 1 Accent 2" w:uiPriority="63"/>
+    <w:lsdException w:name="Medium Shading 2 Accent 2" w:uiPriority="64"/>
+    <w:lsdException w:name="Medium List 1 Accent 2" w:uiPriority="65"/>
+    <w:lsdException w:name="Medium List 2 Accent 2" w:uiPriority="66"/>
+    <w:lsdException w:name="Medium Grid 1 Accent 2" w:uiPriority="67"/>
+    <w:lsdException w:name="Medium Grid 2 Accent 2" w:uiPriority="68"/>
+    <w:lsdException w:name="Medium Grid 3 Accent 2" w:uiPriority="69"/>
+    <w:lsdException w:name="Dark List Accent 2" w:uiPriority="70"/>
+    <w:lsdException w:name="Colorful Shading Accent 2" w:uiPriority="71"/>
+    <w:lsdException w:name="Colorful List Accent 2" w:uiPriority="72"/>
+    <w:lsdException w:name="Colorful Grid Accent 2" w:uiPriority="73"/>
+    <w:lsdException w:name="Light Shading Accent 3" w:uiPriority="60"/>
+    <w:lsdException w:name="Light List Accent 3" w:uiPriority="61"/>
+    <w:lsdException w:name="Light Grid Accent 3" w:uiPriority="62"/>
+    <w:lsdException w:name="Medium Shading 1 Accent 3" w:uiPriority="63"/>
+    <w:lsdException w:name="Medium Shading 2 Accent 3" w:uiPriority="64"/>
+    <w:lsdException w:name="Medium List 1 Accent 3" w:uiPriority="65"/>
+    <w:lsdException w:name="Medium List 2 Accent 3" w:uiPriority="66"/>
+    <w:lsdException w:name="Medium Grid 1 Accent 3" w:uiPriority="67"/>
+    <w:lsdException w:name="Medium Grid 2 Accent 3" w:uiPriority="68"/>
+    <w:lsdException w:name="Medium Grid 3 Accent 3" w:uiPriority="69"/>
+    <w:lsdException w:name="Dark List Accent 3" w:uiPriority="70"/>
+    <w:lsdException w:name="Colorful Shading Accent 3" w:uiPriority="71"/>
+    <w:lsdException w:name="Colorful List Accent 3" w:uiPriority="72"/>
+    <w:lsdException w:name="Colorful Grid Accent 3" w:uiPriority="73"/>
+    <w:lsdException w:name="Light Shading Accent 4" w:uiPriority="60"/>
+    <w:lsdException w:name="Light List Accent 4" w:uiPriority="61"/>
+    <w:lsdException w:name="Light Grid Accent 4" w:uiPriority="62"/>
+    <w:lsdException w:name="Medium Shading 1 Accent 4" w:uiPriority="63"/>
+    <w:lsdException w:name="Medium Shading 2 Accent 4" w:uiPriority="64"/>
+    <w:lsdException w:name="Medium List 1 Accent 4" w:uiPriority="65"/>
+    <w:lsdException w:name="Medium List 2 Accent 4" w:uiPriority="66"/>
+    <w:lsdException w:name="Medium Grid 1 Accent 4" w:uiPriority="67"/>
+    <w:lsdException w:name="Medium Grid 2 Accent 4" w:uiPriority="68"/>
+    <w:lsdException w:name="Medium Grid 3 Accent 4" w:uiPriority="69"/>
+    <w:lsdException w:name="Dark List Accent 4" w:uiPriority="70"/>
+    <w:lsdException w:name="Colorful Shading Accent 4" w:uiPriority="71"/>
+    <w:lsdException w:name="Colorful List Accent 4" w:uiPriority="72"/>
+    <w:lsdException w:name="Colorful Grid Accent 4" w:uiPriority="73"/>
+    <w:lsdException w:name="Light Shading Accent 5" w:uiPriority="60"/>
+    <w:lsdException w:name="Light List Accent 5" w:uiPriority="61"/>
+    <w:lsdException w:name="Light Grid Accent 5" w:uiPriority="62"/>
+    <w:lsdException w:name="Medium Shading 1 Accent 5" w:uiPriority="63"/>
+    <w:lsdException w:name="Medium Shading 2 Accent 5" w:uiPriority="64"/>
+    <w:lsdException w:name="Medium List 1 Accent 5" w:uiPriority="65"/>
+    <w:lsdException w:name="Medium List 2 Accent 5" w:uiPriority="66"/>
+    <w:lsdException w:name="Medium Grid 1 Accent 5" w:uiPriority="67"/>
+    <w:lsdException w:name="Medium Grid 2 Accent 5" w:uiPriority="68"/>
+    <w:lsdException w:name="Medium Grid 3 Accent 5" w:uiPriority="69"/>
+    <w:lsdException w:name="Dark List Accent 5" w:uiPriority="70"/>
+    <w:lsdException w:name="Colorful Shading Accent 5" w:uiPriority="71"/>
+    <w:lsdException w:name="Colorful List Accent 5" w:uiPriority="72"/>
+    <w:lsdException w:name="Colorful Grid Accent 5" w:uiPriority="73"/>
+    <w:lsdException w:name="Light Shading Accent 6" w:uiPriority="60"/>
+    <w:lsdException w:name="Light List Accent 6" w:uiPriority="61"/>
+    <w:lsdException w:name="Light Grid Accent 6" w:uiPriority="62"/>
+    <w:lsdException w:name="Medium Shading 1 Accent 6" w:uiPriority="63"/>
+    <w:lsdException w:name="Medium Shading 2 Accent 6" w:uiPriority="64"/>
+    <w:lsdException w:name="Medium List 1 Accent 6" w:uiPriority="65"/>
+    <w:lsdException w:name="Medium List 2 Accent 6" w:uiPriority="66"/>
+    <w:lsdException w:name="Medium Grid 1 Accent 6" w:uiPriority="67"/>
+    <w:lsdException w:name="Medium Grid 2 Accent 6" w:uiPriority="68"/>
+    <w:lsdException w:name="Medium Grid 3 Accent 6" w:uiPriority="69"/>
+    <w:lsdException w:name="Dark List Accent 6" w:uiPriority="70"/>
+    <w:lsdException w:name="Colorful Shading Accent 6" w:uiPriority="71"/>
+    <w:lsdException w:name="Colorful List Accent 6" w:uiPriority="72"/>
+    <w:lsdException w:name="Colorful Grid Accent 6" w:uiPriority="73"/>
+    <w:lsdException w:name="Subtle Emphasis" w:uiPriority="19" w:qFormat="1"/>
+    <w:lsdException w:name="Intense Emphasis" w:uiPriority="21" w:qFormat="1"/>
+    <w:lsdException w:name="Subtle Reference" w:uiPriority="31" w:qFormat="1"/>
+    <w:lsdException w:name="Intense Reference" w:uiPriority="32" w:qFormat="1"/>
+    <w:lsdException w:name="Book Title" w:uiPriority="33" w:qFormat="1"/>
+    <w:lsdException w:name="Bibliography" w:semiHidden="1" w:uiPriority="37" w:unhideWhenUsed="1"/>
+    <w:lsdException w:name="TOC Heading" w:semiHidden="1" w:uiPriority="39" w:unhideWhenUsed="1" w:qFormat="1"/>
+    <w:lsdException w:name="Plain Table 1" w:uiPriority="41"/>
+    <w:lsdException w:name="Plain Table 2" w:uiPriority="42"/>
+    <w:lsdException w:name="Plain Table 3" w:uiPriority="43"/>
+    <w:lsdException w:name="Plain Table 4" w:uiPriority="44"/>
+    <w:lsdException w:name="Plain Table 5" w:uiPriority="45"/>
+    <w:lsdException w:name="Grid Table Light" w:uiPriority="40"/>
+    <w:lsdException w:name="Grid Table 1 Light" w:uiPriority="46"/>
+    <w:lsdException w:name="Grid Table 2" w:uiPriority="47"/>
+    <w:lsdException w:name="Grid Table 3" w:uiPriority="48"/>
+    <w:lsdException w:name="Grid Table 4" w:uiPriority="49"/>
+    <w:lsdException w:name="Grid Table 5 Dark" w:uiPriority="50"/>
+    <w:lsdException w:name="Grid Table 6 Colorful" w:uiPriority="51"/>
+    <w:lsdException w:name="Grid Table 7 Colorful" w:uiPriority="52"/>
+    <w:lsdException w:name="Grid Table 1 Light Accent 1" w:uiPriority="46"/>
+    <w:lsdException w:name="Grid Table 2 Accent 1" w:uiPriority="47"/>
+    <w:lsdException w:name="Grid Table 3 Accent 1" w:uiPriority="48"/>
+    <w:lsdException w:name="Grid Table 4 Accent 1" w:uiPriority="49"/>
+    <w:lsdException w:name="Grid Table 5 Dark Accent 1" w:uiPriority="50"/>
+    <w:lsdException w:name="Grid Table 6 Colorful Accent 1" w:uiPriority="51"/>
+    <w:lsdException w:name="Grid Table 7 Colorful Accent 1" w:uiPriority="52"/>
+    <w:lsdException w:name="Grid Table 1 Light Accent 2" w:uiPriority="46"/>
+    <w:lsdException w:name="Grid Table 2 Accent 2" w:uiPriority="47"/>
+    <w:lsdException w:name="Grid Table 3 Accent 2" w:uiPriority="48"/>
+    <w:lsdException w:name="Grid Table 4 Accent 2" w:uiPriority="49"/>
+    <w:lsdException w:name="Grid Table 5 Dark Accent 2" w:uiPriority="50"/>
+    <w:lsdException w:name="Grid Table 6 Colorful Accent 2" w:uiPriority="51"/>
+    <w:lsdException w:name="Grid Table 7 Colorful Accent 2" w:uiPriority="52"/>
+    <w:lsdException w:name="Grid Table 1 Light Accent 3" w:uiPriority="46"/>
+    <w:lsdException w:name="Grid Table 2 Accent 3" w:uiPriority="47"/>
+    <w:lsdException w:name="Grid Table 3 Accent 3" w:uiPriority="48"/>
+    <w:lsdException w:name="Grid Table 4 Accent 3" w:uiPriority="49"/>
+    <w:lsdException w:name="Grid Table 5 Dark Accent 3" w:uiPriority="50"/>
+    <w:lsdException w:name="Grid Table 6 Colorful Accent 3" w:uiPriority="51"/>
+    <w:lsdException w:name="Grid Table 7 Colorful Accent 3" w:uiPriority="52"/>
+    <w:lsdException w:name="Grid Table 1 Light Accent 4" w:uiPriority="46"/>
+    <w:lsdException w:name="Grid Table 2 Accent 4" w:uiPriority="47"/>
+    <w:lsdException w:name="Grid Table 3 Accent 4" w:uiPriority="48"/>
+    <w:lsdException w:name="Grid Table 4 Accent 4" w:uiPriority="49"/>
+    <w:lsdException w:name="Grid Table 5 Dark Accent 4" w:uiPriority="50"/>
+    <w:lsdException w:name="Grid Table 6 Colorful Accent 4" w:uiPriority="51"/>
+    <w:lsdException w:name="Grid Table 7 Colorful Accent 4" w:uiPriority="52"/>
+    <w:lsdException w:name="Grid Table 1 Light Accent 5" w:uiPriority="46"/>
+    <w:lsdException w:name="Grid Table 2 Accent 5" w:uiPriority="47"/>
+    <w:lsdException w:name="Grid Table 3 Accent 5" w:uiPriority="48"/>
+    <w:lsdException w:name="Grid Table 4 Accent 5" w:uiPriority="49"/>
+    <w:lsdException w:name="Grid Table 5 Dark Accent 5" w:uiPriority="50"/>
+    <w:lsdException w:name="Grid Table 6 Colorful Accent 5" w:uiPriority="51"/>
+    <w:lsdException w:name="Grid Table 7 Colorful Accent 5" w:uiPriority="52"/>
+    <w:lsdException w:name="Grid Table 1 Light Accent 6" w:uiPriority="46"/>
+    <w:lsdException w:name="Grid Table 2 Accent 6" w:uiPriority="47"/>
+    <w:lsdException w:name="Grid Table 3 Accent 6" w:uiPriority="48"/>
+    <w:lsdException w:name="Grid Table 4 Accent 6" w:uiPriority="49"/>
+    <w:lsdException w:name="Grid Table 5 Dark Accent 6" w:uiPriority="50"/>
+    <w:lsdException w:name="Grid Table 6 Colorful Accent 6" w:uiPriority="51"/>
+    <w:lsdException w:name="Grid Table 7 Colorful Accent 6" w:uiPriority="52"/>
+    <w:lsdException w:name="List Table 1 Light" w:uiPriority="46"/>
+    <w:lsdException w:name="List Table 2" w:uiPriority="47"/>
+    <w:lsdException w:name="List Table 3" w:uiPriority="48"/>
+    <w:lsdException w:name="List Table 4" w:uiPriority="49"/>
+    <w:lsdException w:name="List Table 5 Dark" w:uiPriority="50"/>
+    <w:lsdException w:name="List Table 6 Colorful" w:uiPriority="51"/>
+    <w:lsdException w:name="List Table 7 Colorful" w:uiPriority="52"/>
+    <w:lsdException w:name="List Table 1 Light Accent 1" w:uiPriority="46"/>
+    <w:lsdException w:name="List Table 2 Accent 1" w:uiPriority="47"/>
+    <w:lsdException w:name="List Table 3 Accent 1" w:uiPriority="48"/>
+    <w:lsdException w:name="List Table 4 Accent 1" w:uiPriority="49"/>
+    <w:lsdException w:name="List Table 5 Dark Accent 1" w:uiPriority="50"/>
+    <w:lsdException w:name="List Table 6 Colorful Accent 1" w:uiPriority="51"/>
+    <w:lsdException w:name="List Table 7 Colorful Accent 1" w:uiPriority="52"/>
+    <w:lsdException w:name="List Table 1 Light Accent 2" w:uiPriority="46"/>
+    <w:lsdException w:name="List Table 2 Accent 2" w:uiPriority="47"/>
+    <w:lsdException w:name="List Table 3 Accent 2" w:uiPriority="48"/>
+    <w:lsdException w:name="List Table 4 Accent 2" w:uiPriority="49"/>
+    <w:lsdException w:name="List Table 5 Dark Accent 2" w:uiPriority="50"/>
+    <w:lsdException w:name="List Table 6 Colorful Accent 2" w:uiPriority="51"/>
+    <w:lsdException w:name="List Table 7 Colorful Accent 2" w:uiPriority="52"/>
+    <w:lsdException w:name="List Table 1 Light Accent 3" w:uiPriority="46"/>
+    <w:lsdException w:name="List Table 2 Accent 3" w:uiPriority="47"/>
+    <w:lsdException w:name="List Table 3 Accent 3" w:uiPriority="48"/>
+    <w:lsdException w:name="List Table 4 Accent 3" w:uiPriority="49"/>
+    <w:lsdException w:name="List Table 5 Dark Accent 3" w:uiPriority="50"/>
+    <w:lsdException w:name="List Table 6 Colorful Accent 3" w:uiPriority="51"/>
+    <w:lsdException w:name="List Table 7 Colorful Accent 3" w:uiPriority="52"/>
+    <w:lsdException w:name="List Table 1 Light Accent 4" w:uiPriority="46"/>
+    <w:lsdException w:name="List Table 2 Accent 4" w:uiPriority="47"/>
+    <w:lsdException w:name="List Table 3 Accent 4" w:uiPriority="48"/>
+    <w:lsdException w:name="List Table 4 Accent 4" w:uiPriority="49"/>
+    <w:lsdException w:name="List Table 5 Dark Accent 4" w:uiPriority="50"/>
+    <w:lsdException w:name="List Table 6 Colorful Accent 4" w:uiPriority="51"/>
+    <w:lsdException w:name="List Table 7 Colorful Accent 4" w:uiPriority="52"/>
+    <w:lsdException w:name="List Table 1 Light Accent 5" w:uiPriority="46"/>
+    <w:lsdException w:name="List Table 2 Accent 5" w:uiPriority="47"/>
+    <w:lsdException w:name="List Table 3 Accent 5" w:uiPriority="48"/>
+    <w:lsdException w:name="List Table 4 Accent 5" w:uiPriority="49"/>
+    <w:lsdException w:name="List Table 5 Dark Accent 5" w:uiPriority="50"/>
+    <w:lsdException w:name="List Table 6 Colorful Accent 5" w:uiPriority="51"/>
+    <w:lsdException w:name="List Table 7 Colorful Accent 5" w:uiPriority="52"/>
+    <w:lsdException w:name="List Table 1 Light Accent 6" w:uiPriority="46"/>
+    <w:lsdException w:name="List Table 2 Accent 6" w:uiPriority="47"/>
+    <w:lsdException w:name="List Table 3 Accent 6" w:uiPriority="48"/>
+    <w:lsdException w:name="List Table 4 Accent 6" w:uiPriority="49"/>
+    <w:lsdException w:name="List Table 5 Dark Accent 6" w:uiPriority="50"/>
+    <w:lsdException w:name="List Table 6 Colorful Accent 6" w:uiPriority="51"/>
+    <w:lsdException w:name="List Table 7 Colorful Accent 6" w:uiPriority="52"/>
+    <w:lsdException w:name="Mention" w:semiHidden="1" w:unhideWhenUsed="1"/>
+    <w:lsdException w:name="Smart Hyperlink" w:semiHidden="1" w:unhideWhenUsed="1"/>
+    <w:lsdException w:name="Hashtag" w:semiHidden="1" w:unhideWhenUsed="1"/>
+    <w:lsdException w:name="Unresolved Mention" w:semiHidden="1" w:unhideWhenUsed="1"/>
+    <w:lsdException w:name="Smart Link" w:semiHidden="1" w:unhideWhenUsed="1"/>
+  </w:latentStyles>
+  <w:style w:type="paragraph" w:default="1" w:styleId="Normal">
+    <w:name w:val="Normal"/>
+    <w:qFormat/>
+  </w:style>
+  <w:style w:type="character" w:default="1" w:styleId="DefaultParagraphFont">
+    <w:name w:val="Default Paragraph Font"/>
+    <w:uiPriority w:val="1"/>
+    <w:semiHidden/>
+    <w:unhideWhenUsed/>
+  </w:style>
+  <w:style w:type="table" w:default="1" w:styleId="TableNormal">
+    <w:name w:val="Normal Table"/>
+    <w:uiPriority w:val="99"/>
+    <w:semiHidden/>
+    <w:unhideWhenUsed/>
+    <w:tblPr>
+      <w:tblInd w:w="0" w:type="dxa"/>
+      <w:tblCellMar>
+        <w:top w:w="0" w:type="dxa"/>
+        <w:left w:w="108" w:type="dxa"/>
+        <w:bottom w:w="0" w:type="dxa"/>
+        <w:right w:w="108" w:type="dxa"/>
+      </w:tblCellMar>
+    </w:tblPr>
+  </w:style>
+  <w:style w:type="numbering" w:default="1" w:styleId="NoList">
+    <w:name w:val="No List"/>
+    <w:uiPriority w:val="99"/>
+    <w:semiHidden/>
+    <w:unhideWhenUsed/>
+  </w:style>
+  <w:style w:type="paragraph" w:customStyle="1" w:styleId="7356BB83ADEB4F67AAB9E830F47512E5">
+    <w:name w:val="7356BB83ADEB4F67AAB9E830F47512E5"/>
+    <w:rsid w:val="00663F92"/>
+  </w:style>
+  <w:style w:type="paragraph" w:customStyle="1" w:styleId="29CED19FC6C549D983EDEDA901B71E75">
+    <w:name w:val="29CED19FC6C549D983EDEDA901B71E75"/>
+    <w:rsid w:val="00663F92"/>
+  </w:style>
+</w:styles>
+</file>
+
+<file path=word/glossary/webSettings.xml><?xml version="1.0" encoding="utf-8"?>
+<w:webSettings xmlns:mc="http://schemas.openxmlformats.org/markup-compatibility/2006" xmlns:r="http://schemas.openxmlformats.org/officeDocument/2006/relationships" xmlns:w="http://schemas.openxmlformats.org/wordprocessingml/2006/main" xmlns:w14="http://schemas.microsoft.com/office/word/2010/wordml" xmlns:w15="http://schemas.microsoft.com/office/word/2012/wordml" xmlns:w16cex="http://schemas.microsoft.com/office/word/2018/wordml/cex" xmlns:w16cid="http://schemas.microsoft.com/office/word/2016/wordml/cid" xmlns:w16="http://schemas.microsoft.com/office/word/2018/wordml" xmlns:w16du="http://schemas.microsoft.com/office/word/2023/wordml/word16du" xmlns:w16sdtdh="http://schemas.microsoft.com/office/word/2020/wordml/sdtdatahash" xmlns:w16sdtfl="http://schemas.microsoft.com/office/word/2024/wordml/sdtformatlock" xmlns:w16se="http://schemas.microsoft.com/office/word/2015/wordml/symex" mc:Ignorable="w14 w15 w16se w16cid w16 w16cex w16sdtdh w16sdtfl w16du">
+  <w:optimizeForBrowser/>
+  <w:allowPNG/>
+</w:webSettings>
 </file>
 
 <file path=word/theme/theme1.xml><?xml version="1.0" encoding="utf-8"?>
@@ -2493,10 +3460,29 @@
 </file>
 
 <file path=customXml/item1.xml><?xml version="1.0" encoding="utf-8"?>
+<CoverPageProperties xmlns="http://schemas.microsoft.com/office/2006/coverPageProps">
+  <PublishDate>2026-06-19T00:00:00</PublishDate>
+  <Abstract/>
+  <CompanyAddress/>
+  <CompanyPhone/>
+  <CompanyFax/>
+  <CompanyEmail/>
+</CoverPageProperties>
+</file>
+
+<file path=customXml/item2.xml><?xml version="1.0" encoding="utf-8"?>
 <b:Sources xmlns:b="http://schemas.openxmlformats.org/officeDocument/2006/bibliography" xmlns="http://schemas.openxmlformats.org/officeDocument/2006/bibliography" SelectedStyle="\APASixthEditionOfficeOnline.xsl" StyleName="APA" Version="6"/>
 </file>
 
 <file path=customXml/itemProps1.xml><?xml version="1.0" encoding="utf-8"?>
+<ds:datastoreItem xmlns:ds="http://schemas.openxmlformats.org/officeDocument/2006/customXml" ds:itemID="{55AF091B-3C7A-41E3-B477-F2FDAA23CFDA}">
+  <ds:schemaRefs>
+    <ds:schemaRef ds:uri="http://schemas.microsoft.com/office/2006/coverPageProps"/>
+  </ds:schemaRefs>
+</ds:datastoreItem>
+</file>
+
+<file path=customXml/itemProps2.xml><?xml version="1.0" encoding="utf-8"?>
 <ds:datastoreItem xmlns:ds="http://schemas.openxmlformats.org/officeDocument/2006/customXml" ds:itemID="{FC0CEC37-A536-4666-A9B1-DEF6B9B0BC32}">
   <ds:schemaRefs>
     <ds:schemaRef ds:uri="http://schemas.openxmlformats.org/officeDocument/2006/bibliography"/>

</xml_diff>